<commit_message>
OECD_OECD_compare.py to compare OECD data with the new OECD file Tanveer sent me
</commit_message>
<xml_diff>
--- a/OECD data.docx
+++ b/OECD data.docx
@@ -9,15 +9,13 @@
           <w:rFonts w:asciiTheme="majorBidi" w:hAnsiTheme="majorBidi" w:cstheme="majorBidi"/>
           <w:sz w:val="24"/>
           <w:szCs w:val="24"/>
-          <w:lang w:val="en-IL"/>
-        </w:rPr>
-      </w:pPr>
-      <w:r>
-        <w:rPr>
-          <w:rFonts w:asciiTheme="majorBidi" w:hAnsiTheme="majorBidi" w:cstheme="majorBidi"/>
-          <w:sz w:val="24"/>
-          <w:szCs w:val="24"/>
-          <w:lang w:val="en-IL"/>
+        </w:rPr>
+      </w:pPr>
+      <w:r>
+        <w:rPr>
+          <w:rFonts w:asciiTheme="majorBidi" w:hAnsiTheme="majorBidi" w:cstheme="majorBidi"/>
+          <w:sz w:val="24"/>
+          <w:szCs w:val="24"/>
         </w:rPr>
         <w:t>OECD from data:</w:t>
       </w:r>
@@ -29,7 +27,6 @@
           <w:rFonts w:asciiTheme="majorBidi" w:hAnsiTheme="majorBidi" w:cstheme="majorBidi"/>
           <w:sz w:val="24"/>
           <w:szCs w:val="24"/>
-          <w:lang w:val="en-IL"/>
         </w:rPr>
       </w:pPr>
       <w:proofErr w:type="spellStart"/>
@@ -38,7 +35,6 @@
           <w:rFonts w:asciiTheme="majorBidi" w:hAnsiTheme="majorBidi" w:cstheme="majorBidi"/>
           <w:sz w:val="24"/>
           <w:szCs w:val="24"/>
-          <w:lang w:val="en-IL"/>
         </w:rPr>
         <w:t>F_total</w:t>
       </w:r>
@@ -48,7 +44,6 @@
           <w:rFonts w:asciiTheme="majorBidi" w:hAnsiTheme="majorBidi" w:cstheme="majorBidi"/>
           <w:sz w:val="24"/>
           <w:szCs w:val="24"/>
-          <w:lang w:val="en-IL"/>
         </w:rPr>
         <w:t xml:space="preserve"> = </w:t>
       </w:r>
@@ -60,7 +55,6 @@
           <w:rFonts w:asciiTheme="majorBidi" w:hAnsiTheme="majorBidi" w:cstheme="majorBidi"/>
           <w:sz w:val="24"/>
           <w:szCs w:val="24"/>
-          <w:lang w:val="en-IL"/>
         </w:rPr>
       </w:pPr>
       <w:proofErr w:type="spellStart"/>
@@ -69,7 +63,6 @@
           <w:rFonts w:asciiTheme="majorBidi" w:hAnsiTheme="majorBidi" w:cstheme="majorBidi"/>
           <w:sz w:val="24"/>
           <w:szCs w:val="24"/>
-          <w:lang w:val="en-IL"/>
         </w:rPr>
         <w:t>f_row_sums</w:t>
       </w:r>
@@ -79,7 +72,6 @@
           <w:rFonts w:asciiTheme="majorBidi" w:hAnsiTheme="majorBidi" w:cstheme="majorBidi"/>
           <w:sz w:val="24"/>
           <w:szCs w:val="24"/>
-          <w:lang w:val="en-IL"/>
         </w:rPr>
         <w:t xml:space="preserve"> = </w:t>
       </w:r>
@@ -89,7 +81,6 @@
           <w:rFonts w:asciiTheme="majorBidi" w:hAnsiTheme="majorBidi" w:cstheme="majorBidi"/>
           <w:sz w:val="24"/>
           <w:szCs w:val="24"/>
-          <w:lang w:val="en-IL"/>
         </w:rPr>
         <w:t>OECD.loc</w:t>
       </w:r>
@@ -99,7 +90,6 @@
           <w:rFonts w:asciiTheme="majorBidi" w:hAnsiTheme="majorBidi" w:cstheme="majorBidi"/>
           <w:sz w:val="24"/>
           <w:szCs w:val="24"/>
-          <w:lang w:val="en-IL"/>
         </w:rPr>
         <w:t>[:,['HFCE',    'NPISH',    'GGFC', 'GFCF', 'INVNT',    'DPABR',    'CONS_NONRES',  'EXPO', 'IMPO']].sum(axis=1)</w:t>
       </w:r>
@@ -111,15 +101,13 @@
           <w:rFonts w:asciiTheme="majorBidi" w:hAnsiTheme="majorBidi" w:cstheme="majorBidi"/>
           <w:sz w:val="24"/>
           <w:szCs w:val="24"/>
-          <w:lang w:val="en-IL"/>
-        </w:rPr>
-      </w:pPr>
-      <w:r>
-        <w:rPr>
-          <w:rFonts w:asciiTheme="majorBidi" w:hAnsiTheme="majorBidi" w:cstheme="majorBidi"/>
-          <w:sz w:val="24"/>
-          <w:szCs w:val="24"/>
-          <w:lang w:val="en-IL"/>
+        </w:rPr>
+      </w:pPr>
+      <w:r>
+        <w:rPr>
+          <w:rFonts w:asciiTheme="majorBidi" w:hAnsiTheme="majorBidi" w:cstheme="majorBidi"/>
+          <w:sz w:val="24"/>
+          <w:szCs w:val="24"/>
         </w:rPr>
         <w:t>sum of household final demand</w:t>
       </w:r>
@@ -131,48 +119,43 @@
           <w:rFonts w:asciiTheme="majorBidi" w:hAnsiTheme="majorBidi" w:cstheme="majorBidi"/>
           <w:sz w:val="24"/>
           <w:szCs w:val="24"/>
-          <w:lang w:val="en-IL"/>
-        </w:rPr>
-      </w:pPr>
-    </w:p>
-    <w:p>
-      <w:pPr>
-        <w:spacing w:after="0"/>
-        <w:rPr>
-          <w:rFonts w:asciiTheme="majorBidi" w:hAnsiTheme="majorBidi" w:cstheme="majorBidi"/>
-          <w:sz w:val="24"/>
-          <w:szCs w:val="24"/>
-          <w:lang w:val="en-IL"/>
-        </w:rPr>
-      </w:pPr>
-    </w:p>
-    <w:p>
-      <w:pPr>
-        <w:spacing w:after="0"/>
-        <w:rPr>
-          <w:rFonts w:asciiTheme="majorBidi" w:hAnsiTheme="majorBidi" w:cstheme="majorBidi"/>
-          <w:sz w:val="24"/>
-          <w:szCs w:val="24"/>
-          <w:lang w:val="en-IL"/>
-        </w:rPr>
-      </w:pPr>
-    </w:p>
-    <w:p>
-      <w:pPr>
-        <w:spacing w:after="0"/>
-        <w:rPr>
-          <w:rFonts w:asciiTheme="majorBidi" w:hAnsiTheme="majorBidi" w:cstheme="majorBidi"/>
-          <w:sz w:val="24"/>
-          <w:szCs w:val="24"/>
-          <w:lang w:val="en-IL"/>
-        </w:rPr>
-      </w:pPr>
-      <w:r>
-        <w:rPr>
-          <w:rFonts w:asciiTheme="majorBidi" w:hAnsiTheme="majorBidi" w:cstheme="majorBidi"/>
-          <w:sz w:val="24"/>
-          <w:szCs w:val="24"/>
-          <w:lang w:val="en-IL"/>
+        </w:rPr>
+      </w:pPr>
+    </w:p>
+    <w:p>
+      <w:pPr>
+        <w:spacing w:after="0"/>
+        <w:rPr>
+          <w:rFonts w:asciiTheme="majorBidi" w:hAnsiTheme="majorBidi" w:cstheme="majorBidi"/>
+          <w:sz w:val="24"/>
+          <w:szCs w:val="24"/>
+        </w:rPr>
+      </w:pPr>
+    </w:p>
+    <w:p>
+      <w:pPr>
+        <w:spacing w:after="0"/>
+        <w:rPr>
+          <w:rFonts w:asciiTheme="majorBidi" w:hAnsiTheme="majorBidi" w:cstheme="majorBidi"/>
+          <w:sz w:val="24"/>
+          <w:szCs w:val="24"/>
+        </w:rPr>
+      </w:pPr>
+    </w:p>
+    <w:p>
+      <w:pPr>
+        <w:spacing w:after="0"/>
+        <w:rPr>
+          <w:rFonts w:asciiTheme="majorBidi" w:hAnsiTheme="majorBidi" w:cstheme="majorBidi"/>
+          <w:sz w:val="24"/>
+          <w:szCs w:val="24"/>
+        </w:rPr>
+      </w:pPr>
+      <w:r>
+        <w:rPr>
+          <w:rFonts w:asciiTheme="majorBidi" w:hAnsiTheme="majorBidi" w:cstheme="majorBidi"/>
+          <w:sz w:val="24"/>
+          <w:szCs w:val="24"/>
         </w:rPr>
         <w:t>print()</w:t>
       </w:r>
@@ -184,15 +167,13 @@
           <w:rFonts w:asciiTheme="majorBidi" w:hAnsiTheme="majorBidi" w:cstheme="majorBidi"/>
           <w:sz w:val="24"/>
           <w:szCs w:val="24"/>
-          <w:lang w:val="en-IL"/>
-        </w:rPr>
-      </w:pPr>
-      <w:r>
-        <w:rPr>
-          <w:rFonts w:asciiTheme="majorBidi" w:hAnsiTheme="majorBidi" w:cstheme="majorBidi"/>
-          <w:sz w:val="24"/>
-          <w:szCs w:val="24"/>
-          <w:lang w:val="en-IL"/>
+        </w:rPr>
+      </w:pPr>
+      <w:r>
+        <w:rPr>
+          <w:rFonts w:asciiTheme="majorBidi" w:hAnsiTheme="majorBidi" w:cstheme="majorBidi"/>
+          <w:sz w:val="24"/>
+          <w:szCs w:val="24"/>
         </w:rPr>
         <w:t xml:space="preserve">print( </w:t>
       </w:r>
@@ -202,7 +183,6 @@
           <w:rFonts w:asciiTheme="majorBidi" w:hAnsiTheme="majorBidi" w:cstheme="majorBidi"/>
           <w:sz w:val="24"/>
           <w:szCs w:val="24"/>
-          <w:lang w:val="en-IL"/>
         </w:rPr>
         <w:t>pd.DataFrame</w:t>
       </w:r>
@@ -212,7 +192,6 @@
           <w:rFonts w:asciiTheme="majorBidi" w:hAnsiTheme="majorBidi" w:cstheme="majorBidi"/>
           <w:sz w:val="24"/>
           <w:szCs w:val="24"/>
-          <w:lang w:val="en-IL"/>
         </w:rPr>
         <w:t>({</w:t>
       </w:r>
@@ -224,15 +203,13 @@
           <w:rFonts w:asciiTheme="majorBidi" w:hAnsiTheme="majorBidi" w:cstheme="majorBidi"/>
           <w:sz w:val="24"/>
           <w:szCs w:val="24"/>
-          <w:lang w:val="en-IL"/>
-        </w:rPr>
-      </w:pPr>
-      <w:r>
-        <w:rPr>
-          <w:rFonts w:asciiTheme="majorBidi" w:hAnsiTheme="majorBidi" w:cstheme="majorBidi"/>
-          <w:sz w:val="24"/>
-          <w:szCs w:val="24"/>
-          <w:lang w:val="en-IL"/>
+        </w:rPr>
+      </w:pPr>
+      <w:r>
+        <w:rPr>
+          <w:rFonts w:asciiTheme="majorBidi" w:hAnsiTheme="majorBidi" w:cstheme="majorBidi"/>
+          <w:sz w:val="24"/>
+          <w:szCs w:val="24"/>
         </w:rPr>
         <w:t>        'total': output,</w:t>
       </w:r>
@@ -244,15 +221,13 @@
           <w:rFonts w:asciiTheme="majorBidi" w:hAnsiTheme="majorBidi" w:cstheme="majorBidi"/>
           <w:sz w:val="24"/>
           <w:szCs w:val="24"/>
-          <w:lang w:val="en-IL"/>
-        </w:rPr>
-      </w:pPr>
-      <w:r>
-        <w:rPr>
-          <w:rFonts w:asciiTheme="majorBidi" w:hAnsiTheme="majorBidi" w:cstheme="majorBidi"/>
-          <w:sz w:val="24"/>
-          <w:szCs w:val="24"/>
-          <w:lang w:val="en-IL"/>
+        </w:rPr>
+      </w:pPr>
+      <w:r>
+        <w:rPr>
+          <w:rFonts w:asciiTheme="majorBidi" w:hAnsiTheme="majorBidi" w:cstheme="majorBidi"/>
+          <w:sz w:val="24"/>
+          <w:szCs w:val="24"/>
         </w:rPr>
         <w:t xml:space="preserve">        'sum over columns': </w:t>
       </w:r>
@@ -262,7 +237,6 @@
           <w:rFonts w:asciiTheme="majorBidi" w:hAnsiTheme="majorBidi" w:cstheme="majorBidi"/>
           <w:sz w:val="24"/>
           <w:szCs w:val="24"/>
-          <w:lang w:val="en-IL"/>
         </w:rPr>
         <w:t>II.sum</w:t>
       </w:r>
@@ -272,7 +246,6 @@
           <w:rFonts w:asciiTheme="majorBidi" w:hAnsiTheme="majorBidi" w:cstheme="majorBidi"/>
           <w:sz w:val="24"/>
           <w:szCs w:val="24"/>
-          <w:lang w:val="en-IL"/>
         </w:rPr>
         <w:t xml:space="preserve">(axis=1) + </w:t>
       </w:r>
@@ -282,7 +255,6 @@
           <w:rFonts w:asciiTheme="majorBidi" w:hAnsiTheme="majorBidi" w:cstheme="majorBidi"/>
           <w:sz w:val="24"/>
           <w:szCs w:val="24"/>
-          <w:lang w:val="en-IL"/>
         </w:rPr>
         <w:t>household_expenditure</w:t>
       </w:r>
@@ -292,7 +264,6 @@
           <w:rFonts w:asciiTheme="majorBidi" w:hAnsiTheme="majorBidi" w:cstheme="majorBidi"/>
           <w:sz w:val="24"/>
           <w:szCs w:val="24"/>
-          <w:lang w:val="en-IL"/>
         </w:rPr>
         <w:t xml:space="preserve"> + </w:t>
       </w:r>
@@ -302,7 +273,6 @@
           <w:rFonts w:asciiTheme="majorBidi" w:hAnsiTheme="majorBidi" w:cstheme="majorBidi"/>
           <w:sz w:val="24"/>
           <w:szCs w:val="24"/>
-          <w:lang w:val="en-IL"/>
         </w:rPr>
         <w:t>other_final_demand.sum</w:t>
       </w:r>
@@ -312,7 +282,6 @@
           <w:rFonts w:asciiTheme="majorBidi" w:hAnsiTheme="majorBidi" w:cstheme="majorBidi"/>
           <w:sz w:val="24"/>
           <w:szCs w:val="24"/>
-          <w:lang w:val="en-IL"/>
         </w:rPr>
         <w:t>(axis=1) ,</w:t>
       </w:r>
@@ -324,15 +293,13 @@
           <w:rFonts w:asciiTheme="majorBidi" w:hAnsiTheme="majorBidi" w:cstheme="majorBidi"/>
           <w:sz w:val="24"/>
           <w:szCs w:val="24"/>
-          <w:lang w:val="en-IL"/>
-        </w:rPr>
-      </w:pPr>
-      <w:r>
-        <w:rPr>
-          <w:rFonts w:asciiTheme="majorBidi" w:hAnsiTheme="majorBidi" w:cstheme="majorBidi"/>
-          <w:sz w:val="24"/>
-          <w:szCs w:val="24"/>
-          <w:lang w:val="en-IL"/>
+        </w:rPr>
+      </w:pPr>
+      <w:r>
+        <w:rPr>
+          <w:rFonts w:asciiTheme="majorBidi" w:hAnsiTheme="majorBidi" w:cstheme="majorBidi"/>
+          <w:sz w:val="24"/>
+          <w:szCs w:val="24"/>
         </w:rPr>
         <w:t xml:space="preserve">        'sum over rows - small': </w:t>
       </w:r>
@@ -342,7 +309,6 @@
           <w:rFonts w:asciiTheme="majorBidi" w:hAnsiTheme="majorBidi" w:cstheme="majorBidi"/>
           <w:sz w:val="24"/>
           <w:szCs w:val="24"/>
-          <w:lang w:val="en-IL"/>
         </w:rPr>
         <w:t>II.sum</w:t>
       </w:r>
@@ -352,7 +318,6 @@
           <w:rFonts w:asciiTheme="majorBidi" w:hAnsiTheme="majorBidi" w:cstheme="majorBidi"/>
           <w:sz w:val="24"/>
           <w:szCs w:val="24"/>
-          <w:lang w:val="en-IL"/>
         </w:rPr>
         <w:t>(axis=0) + GDP,</w:t>
       </w:r>
@@ -364,15 +329,13 @@
           <w:rFonts w:asciiTheme="majorBidi" w:hAnsiTheme="majorBidi" w:cstheme="majorBidi"/>
           <w:sz w:val="24"/>
           <w:szCs w:val="24"/>
-          <w:lang w:val="en-IL"/>
-        </w:rPr>
-      </w:pPr>
-      <w:r>
-        <w:rPr>
-          <w:rFonts w:asciiTheme="majorBidi" w:hAnsiTheme="majorBidi" w:cstheme="majorBidi"/>
-          <w:sz w:val="24"/>
-          <w:szCs w:val="24"/>
-          <w:lang w:val="en-IL"/>
+        </w:rPr>
+      </w:pPr>
+      <w:r>
+        <w:rPr>
+          <w:rFonts w:asciiTheme="majorBidi" w:hAnsiTheme="majorBidi" w:cstheme="majorBidi"/>
+          <w:sz w:val="24"/>
+          <w:szCs w:val="24"/>
         </w:rPr>
         <w:t xml:space="preserve">        'sum over rows - </w:t>
       </w:r>
@@ -382,7 +345,6 @@
           <w:rFonts w:asciiTheme="majorBidi" w:hAnsiTheme="majorBidi" w:cstheme="majorBidi"/>
           <w:sz w:val="24"/>
           <w:szCs w:val="24"/>
-          <w:lang w:val="en-IL"/>
         </w:rPr>
         <w:t>OECD_rough</w:t>
       </w:r>
@@ -392,7 +354,6 @@
           <w:rFonts w:asciiTheme="majorBidi" w:hAnsiTheme="majorBidi" w:cstheme="majorBidi"/>
           <w:sz w:val="24"/>
           <w:szCs w:val="24"/>
-          <w:lang w:val="en-IL"/>
         </w:rPr>
         <w:t xml:space="preserve">': </w:t>
       </w:r>
@@ -402,7 +363,6 @@
           <w:rFonts w:asciiTheme="majorBidi" w:hAnsiTheme="majorBidi" w:cstheme="majorBidi"/>
           <w:sz w:val="24"/>
           <w:szCs w:val="24"/>
-          <w:lang w:val="en-IL"/>
         </w:rPr>
         <w:t>OECD.loc</w:t>
       </w:r>
@@ -412,7 +372,6 @@
           <w:rFonts w:asciiTheme="majorBidi" w:hAnsiTheme="majorBidi" w:cstheme="majorBidi"/>
           <w:sz w:val="24"/>
           <w:szCs w:val="24"/>
-          <w:lang w:val="en-IL"/>
         </w:rPr>
         <w:t xml:space="preserve">['A01_02':'T', </w:t>
       </w:r>
@@ -422,7 +381,6 @@
           <w:rFonts w:asciiTheme="majorBidi" w:hAnsiTheme="majorBidi" w:cstheme="majorBidi"/>
           <w:sz w:val="24"/>
           <w:szCs w:val="24"/>
-          <w:lang w:val="en-IL"/>
         </w:rPr>
         <w:t>simple_II_labels</w:t>
       </w:r>
@@ -432,7 +390,6 @@
           <w:rFonts w:asciiTheme="majorBidi" w:hAnsiTheme="majorBidi" w:cstheme="majorBidi"/>
           <w:sz w:val="24"/>
           <w:szCs w:val="24"/>
-          <w:lang w:val="en-IL"/>
         </w:rPr>
         <w:t xml:space="preserve">].sum(axis=0) + GDP #+ </w:t>
       </w:r>
@@ -442,7 +399,6 @@
           <w:rFonts w:asciiTheme="majorBidi" w:hAnsiTheme="majorBidi" w:cstheme="majorBidi"/>
           <w:sz w:val="24"/>
           <w:szCs w:val="24"/>
-          <w:lang w:val="en-IL"/>
         </w:rPr>
         <w:t>OECD.loc</w:t>
       </w:r>
@@ -452,7 +408,6 @@
           <w:rFonts w:asciiTheme="majorBidi" w:hAnsiTheme="majorBidi" w:cstheme="majorBidi"/>
           <w:sz w:val="24"/>
           <w:szCs w:val="24"/>
-          <w:lang w:val="en-IL"/>
         </w:rPr>
         <w:t>['TTL_INT_FNL',</w:t>
       </w:r>
@@ -462,7 +417,6 @@
           <w:rFonts w:asciiTheme="majorBidi" w:hAnsiTheme="majorBidi" w:cstheme="majorBidi"/>
           <w:sz w:val="24"/>
           <w:szCs w:val="24"/>
-          <w:lang w:val="en-IL"/>
         </w:rPr>
         <w:t>simple_II_labels</w:t>
       </w:r>
@@ -472,7 +426,6 @@
           <w:rFonts w:asciiTheme="majorBidi" w:hAnsiTheme="majorBidi" w:cstheme="majorBidi"/>
           <w:sz w:val="24"/>
           <w:szCs w:val="24"/>
-          <w:lang w:val="en-IL"/>
         </w:rPr>
         <w:t>].sum(axis=0)</w:t>
       </w:r>
@@ -484,15 +437,13 @@
           <w:rFonts w:asciiTheme="majorBidi" w:hAnsiTheme="majorBidi" w:cstheme="majorBidi"/>
           <w:sz w:val="24"/>
           <w:szCs w:val="24"/>
-          <w:lang w:val="en-IL"/>
-        </w:rPr>
-      </w:pPr>
-      <w:r>
-        <w:rPr>
-          <w:rFonts w:asciiTheme="majorBidi" w:hAnsiTheme="majorBidi" w:cstheme="majorBidi"/>
-          <w:sz w:val="24"/>
-          <w:szCs w:val="24"/>
-          <w:lang w:val="en-IL"/>
+        </w:rPr>
+      </w:pPr>
+      <w:r>
+        <w:rPr>
+          <w:rFonts w:asciiTheme="majorBidi" w:hAnsiTheme="majorBidi" w:cstheme="majorBidi"/>
+          <w:sz w:val="24"/>
+          <w:szCs w:val="24"/>
         </w:rPr>
         <w:t>})</w:t>
       </w:r>
@@ -504,15 +455,13 @@
           <w:rFonts w:asciiTheme="majorBidi" w:hAnsiTheme="majorBidi" w:cstheme="majorBidi"/>
           <w:sz w:val="24"/>
           <w:szCs w:val="24"/>
-          <w:lang w:val="en-IL"/>
-        </w:rPr>
-      </w:pPr>
-      <w:r>
-        <w:rPr>
-          <w:rFonts w:asciiTheme="majorBidi" w:hAnsiTheme="majorBidi" w:cstheme="majorBidi"/>
-          <w:sz w:val="24"/>
-          <w:szCs w:val="24"/>
-          <w:lang w:val="en-IL"/>
+        </w:rPr>
+      </w:pPr>
+      <w:r>
+        <w:rPr>
+          <w:rFonts w:asciiTheme="majorBidi" w:hAnsiTheme="majorBidi" w:cstheme="majorBidi"/>
+          <w:sz w:val="24"/>
+          <w:szCs w:val="24"/>
         </w:rPr>
         <w:t>)</w:t>
       </w:r>
@@ -524,15 +473,13 @@
           <w:rFonts w:asciiTheme="majorBidi" w:hAnsiTheme="majorBidi" w:cstheme="majorBidi"/>
           <w:sz w:val="24"/>
           <w:szCs w:val="24"/>
-          <w:lang w:val="en-IL"/>
-        </w:rPr>
-      </w:pPr>
-      <w:r>
-        <w:rPr>
-          <w:rFonts w:asciiTheme="majorBidi" w:hAnsiTheme="majorBidi" w:cstheme="majorBidi"/>
-          <w:sz w:val="24"/>
-          <w:szCs w:val="24"/>
-          <w:lang w:val="en-IL"/>
+        </w:rPr>
+      </w:pPr>
+      <w:r>
+        <w:rPr>
+          <w:rFonts w:asciiTheme="majorBidi" w:hAnsiTheme="majorBidi" w:cstheme="majorBidi"/>
+          <w:sz w:val="24"/>
+          <w:szCs w:val="24"/>
         </w:rPr>
         <w:t>I played with it but I cant’ calculate GDP – it is not a simple sum of GDP plus something equals input</w:t>
       </w:r>
@@ -544,15 +491,13 @@
           <w:rFonts w:asciiTheme="majorBidi" w:hAnsiTheme="majorBidi" w:cstheme="majorBidi"/>
           <w:sz w:val="24"/>
           <w:szCs w:val="24"/>
-          <w:lang w:val="en-IL"/>
-        </w:rPr>
-      </w:pPr>
-      <w:r>
-        <w:rPr>
-          <w:rFonts w:asciiTheme="majorBidi" w:hAnsiTheme="majorBidi" w:cstheme="majorBidi"/>
-          <w:sz w:val="24"/>
-          <w:szCs w:val="24"/>
-          <w:lang w:val="en-IL"/>
+        </w:rPr>
+      </w:pPr>
+      <w:r>
+        <w:rPr>
+          <w:rFonts w:asciiTheme="majorBidi" w:hAnsiTheme="majorBidi" w:cstheme="majorBidi"/>
+          <w:sz w:val="24"/>
+          <w:szCs w:val="24"/>
         </w:rPr>
         <w:t>And GDP does not equal final demand</w:t>
       </w:r>
@@ -564,26 +509,23 @@
           <w:rFonts w:asciiTheme="majorBidi" w:hAnsiTheme="majorBidi" w:cstheme="majorBidi"/>
           <w:sz w:val="24"/>
           <w:szCs w:val="24"/>
-          <w:lang w:val="en-IL"/>
-        </w:rPr>
-      </w:pPr>
-    </w:p>
-    <w:p>
-      <w:pPr>
-        <w:spacing w:after="0"/>
-        <w:rPr>
-          <w:rFonts w:asciiTheme="majorBidi" w:hAnsiTheme="majorBidi" w:cstheme="majorBidi"/>
-          <w:sz w:val="24"/>
-          <w:szCs w:val="24"/>
-          <w:lang w:val="en-IL"/>
-        </w:rPr>
-      </w:pPr>
-      <w:r>
-        <w:rPr>
-          <w:rFonts w:asciiTheme="majorBidi" w:hAnsiTheme="majorBidi" w:cstheme="majorBidi"/>
-          <w:sz w:val="24"/>
-          <w:szCs w:val="24"/>
-          <w:lang w:val="en-IL"/>
+        </w:rPr>
+      </w:pPr>
+    </w:p>
+    <w:p>
+      <w:pPr>
+        <w:spacing w:after="0"/>
+        <w:rPr>
+          <w:rFonts w:asciiTheme="majorBidi" w:hAnsiTheme="majorBidi" w:cstheme="majorBidi"/>
+          <w:sz w:val="24"/>
+          <w:szCs w:val="24"/>
+        </w:rPr>
+      </w:pPr>
+      <w:r>
+        <w:rPr>
+          <w:rFonts w:asciiTheme="majorBidi" w:hAnsiTheme="majorBidi" w:cstheme="majorBidi"/>
+          <w:sz w:val="24"/>
+          <w:szCs w:val="24"/>
         </w:rPr>
         <w:t xml:space="preserve">print( </w:t>
       </w:r>
@@ -593,7 +535,6 @@
           <w:rFonts w:asciiTheme="majorBidi" w:hAnsiTheme="majorBidi" w:cstheme="majorBidi"/>
           <w:sz w:val="24"/>
           <w:szCs w:val="24"/>
-          <w:lang w:val="en-IL"/>
         </w:rPr>
         <w:t>pd.DataFrame</w:t>
       </w:r>
@@ -603,7 +544,6 @@
           <w:rFonts w:asciiTheme="majorBidi" w:hAnsiTheme="majorBidi" w:cstheme="majorBidi"/>
           <w:sz w:val="24"/>
           <w:szCs w:val="24"/>
-          <w:lang w:val="en-IL"/>
         </w:rPr>
         <w:t>({</w:t>
       </w:r>
@@ -615,15 +555,13 @@
           <w:rFonts w:asciiTheme="majorBidi" w:hAnsiTheme="majorBidi" w:cstheme="majorBidi"/>
           <w:sz w:val="24"/>
           <w:szCs w:val="24"/>
-          <w:lang w:val="en-IL"/>
-        </w:rPr>
-      </w:pPr>
-      <w:r>
-        <w:rPr>
-          <w:rFonts w:asciiTheme="majorBidi" w:hAnsiTheme="majorBidi" w:cstheme="majorBidi"/>
-          <w:sz w:val="24"/>
-          <w:szCs w:val="24"/>
-          <w:lang w:val="en-IL"/>
+        </w:rPr>
+      </w:pPr>
+      <w:r>
+        <w:rPr>
+          <w:rFonts w:asciiTheme="majorBidi" w:hAnsiTheme="majorBidi" w:cstheme="majorBidi"/>
+          <w:sz w:val="24"/>
+          <w:szCs w:val="24"/>
         </w:rPr>
         <w:t xml:space="preserve">        'final demand': </w:t>
       </w:r>
@@ -633,7 +571,6 @@
           <w:rFonts w:asciiTheme="majorBidi" w:hAnsiTheme="majorBidi" w:cstheme="majorBidi"/>
           <w:sz w:val="24"/>
           <w:szCs w:val="24"/>
-          <w:lang w:val="en-IL"/>
         </w:rPr>
         <w:t>household_expenditure</w:t>
       </w:r>
@@ -643,7 +580,6 @@
           <w:rFonts w:asciiTheme="majorBidi" w:hAnsiTheme="majorBidi" w:cstheme="majorBidi"/>
           <w:sz w:val="24"/>
           <w:szCs w:val="24"/>
-          <w:lang w:val="en-IL"/>
         </w:rPr>
         <w:t xml:space="preserve"> + </w:t>
       </w:r>
@@ -653,7 +589,6 @@
           <w:rFonts w:asciiTheme="majorBidi" w:hAnsiTheme="majorBidi" w:cstheme="majorBidi"/>
           <w:sz w:val="24"/>
           <w:szCs w:val="24"/>
-          <w:lang w:val="en-IL"/>
         </w:rPr>
         <w:t>other_final_demand.sum</w:t>
       </w:r>
@@ -663,7 +598,6 @@
           <w:rFonts w:asciiTheme="majorBidi" w:hAnsiTheme="majorBidi" w:cstheme="majorBidi"/>
           <w:sz w:val="24"/>
           <w:szCs w:val="24"/>
-          <w:lang w:val="en-IL"/>
         </w:rPr>
         <w:t>(axis=1) ,</w:t>
       </w:r>
@@ -675,15 +609,13 @@
           <w:rFonts w:asciiTheme="majorBidi" w:hAnsiTheme="majorBidi" w:cstheme="majorBidi"/>
           <w:sz w:val="24"/>
           <w:szCs w:val="24"/>
-          <w:lang w:val="en-IL"/>
-        </w:rPr>
-      </w:pPr>
-      <w:r>
-        <w:rPr>
-          <w:rFonts w:asciiTheme="majorBidi" w:hAnsiTheme="majorBidi" w:cstheme="majorBidi"/>
-          <w:sz w:val="24"/>
-          <w:szCs w:val="24"/>
-          <w:lang w:val="en-IL"/>
+        </w:rPr>
+      </w:pPr>
+      <w:r>
+        <w:rPr>
+          <w:rFonts w:asciiTheme="majorBidi" w:hAnsiTheme="majorBidi" w:cstheme="majorBidi"/>
+          <w:sz w:val="24"/>
+          <w:szCs w:val="24"/>
         </w:rPr>
         <w:t>        'Value Added': GDP</w:t>
       </w:r>
@@ -695,15 +627,13 @@
           <w:rFonts w:asciiTheme="majorBidi" w:hAnsiTheme="majorBidi" w:cstheme="majorBidi"/>
           <w:sz w:val="24"/>
           <w:szCs w:val="24"/>
-          <w:lang w:val="en-IL"/>
-        </w:rPr>
-      </w:pPr>
-      <w:r>
-        <w:rPr>
-          <w:rFonts w:asciiTheme="majorBidi" w:hAnsiTheme="majorBidi" w:cstheme="majorBidi"/>
-          <w:sz w:val="24"/>
-          <w:szCs w:val="24"/>
-          <w:lang w:val="en-IL"/>
+        </w:rPr>
+      </w:pPr>
+      <w:r>
+        <w:rPr>
+          <w:rFonts w:asciiTheme="majorBidi" w:hAnsiTheme="majorBidi" w:cstheme="majorBidi"/>
+          <w:sz w:val="24"/>
+          <w:szCs w:val="24"/>
         </w:rPr>
         <w:t>    }) )</w:t>
       </w:r>
@@ -715,26 +645,23 @@
           <w:rFonts w:asciiTheme="majorBidi" w:hAnsiTheme="majorBidi" w:cstheme="majorBidi"/>
           <w:sz w:val="24"/>
           <w:szCs w:val="24"/>
-          <w:lang w:val="en-IL"/>
-        </w:rPr>
-      </w:pPr>
-    </w:p>
-    <w:p>
-      <w:pPr>
-        <w:spacing w:after="0"/>
-        <w:rPr>
-          <w:rFonts w:asciiTheme="majorBidi" w:hAnsiTheme="majorBidi" w:cstheme="majorBidi"/>
-          <w:sz w:val="24"/>
-          <w:szCs w:val="24"/>
-          <w:lang w:val="en-IL"/>
-        </w:rPr>
-      </w:pPr>
-      <w:r>
-        <w:rPr>
-          <w:rFonts w:asciiTheme="majorBidi" w:hAnsiTheme="majorBidi" w:cstheme="majorBidi"/>
-          <w:sz w:val="24"/>
-          <w:szCs w:val="24"/>
-          <w:lang w:val="en-IL"/>
+        </w:rPr>
+      </w:pPr>
+    </w:p>
+    <w:p>
+      <w:pPr>
+        <w:spacing w:after="0"/>
+        <w:rPr>
+          <w:rFonts w:asciiTheme="majorBidi" w:hAnsiTheme="majorBidi" w:cstheme="majorBidi"/>
+          <w:sz w:val="24"/>
+          <w:szCs w:val="24"/>
+        </w:rPr>
+      </w:pPr>
+      <w:r>
+        <w:rPr>
+          <w:rFonts w:asciiTheme="majorBidi" w:hAnsiTheme="majorBidi" w:cstheme="majorBidi"/>
+          <w:sz w:val="24"/>
+          <w:szCs w:val="24"/>
         </w:rPr>
         <w:t>Final demand and value added are not the same at all</w:t>
       </w:r>
@@ -746,18 +673,16 @@
           <w:rFonts w:asciiTheme="majorBidi" w:hAnsiTheme="majorBidi" w:cstheme="majorBidi"/>
           <w:sz w:val="24"/>
           <w:szCs w:val="24"/>
-          <w:lang w:val="en-IL"/>
-        </w:rPr>
-      </w:pPr>
-    </w:p>
-    <w:p>
-      <w:pPr>
-        <w:spacing w:after="0"/>
-        <w:rPr>
-          <w:rFonts w:asciiTheme="majorBidi" w:hAnsiTheme="majorBidi" w:cstheme="majorBidi"/>
-          <w:sz w:val="24"/>
-          <w:szCs w:val="24"/>
-          <w:lang w:val="en-IL"/>
+        </w:rPr>
+      </w:pPr>
+    </w:p>
+    <w:p>
+      <w:pPr>
+        <w:spacing w:after="0"/>
+        <w:rPr>
+          <w:rFonts w:asciiTheme="majorBidi" w:hAnsiTheme="majorBidi" w:cstheme="majorBidi"/>
+          <w:sz w:val="24"/>
+          <w:szCs w:val="24"/>
         </w:rPr>
       </w:pPr>
       <w:proofErr w:type="spellStart"/>
@@ -766,7 +691,6 @@
           <w:rFonts w:asciiTheme="majorBidi" w:hAnsiTheme="majorBidi" w:cstheme="majorBidi"/>
           <w:sz w:val="24"/>
           <w:szCs w:val="24"/>
-          <w:lang w:val="en-IL"/>
         </w:rPr>
         <w:t>Chatgpt</w:t>
       </w:r>
@@ -776,7 +700,6 @@
           <w:rFonts w:asciiTheme="majorBidi" w:hAnsiTheme="majorBidi" w:cstheme="majorBidi"/>
           <w:sz w:val="24"/>
           <w:szCs w:val="24"/>
-          <w:lang w:val="en-IL"/>
         </w:rPr>
         <w:t>:</w:t>
       </w:r>
@@ -788,26 +711,23 @@
           <w:rFonts w:asciiTheme="majorBidi" w:hAnsiTheme="majorBidi" w:cstheme="majorBidi"/>
           <w:sz w:val="24"/>
           <w:szCs w:val="24"/>
-          <w:lang w:val="en-IL"/>
-        </w:rPr>
-      </w:pPr>
-    </w:p>
-    <w:p>
-      <w:pPr>
-        <w:spacing w:after="0"/>
-        <w:rPr>
-          <w:rFonts w:asciiTheme="majorBidi" w:hAnsiTheme="majorBidi" w:cstheme="majorBidi"/>
-          <w:sz w:val="24"/>
-          <w:szCs w:val="24"/>
-          <w:lang w:val="en-IL"/>
-        </w:rPr>
-      </w:pPr>
-      <w:r>
-        <w:rPr>
-          <w:rFonts w:asciiTheme="majorBidi" w:hAnsiTheme="majorBidi" w:cstheme="majorBidi"/>
-          <w:sz w:val="24"/>
-          <w:szCs w:val="24"/>
-          <w:lang w:val="en-IL"/>
+        </w:rPr>
+      </w:pPr>
+    </w:p>
+    <w:p>
+      <w:pPr>
+        <w:spacing w:after="0"/>
+        <w:rPr>
+          <w:rFonts w:asciiTheme="majorBidi" w:hAnsiTheme="majorBidi" w:cstheme="majorBidi"/>
+          <w:sz w:val="24"/>
+          <w:szCs w:val="24"/>
+        </w:rPr>
+      </w:pPr>
+      <w:r>
+        <w:rPr>
+          <w:rFonts w:asciiTheme="majorBidi" w:hAnsiTheme="majorBidi" w:cstheme="majorBidi"/>
+          <w:sz w:val="24"/>
+          <w:szCs w:val="24"/>
         </w:rPr>
         <w:t xml:space="preserve">  </w:t>
       </w:r>
@@ -818,7 +738,6 @@
           <w:bCs/>
           <w:sz w:val="24"/>
           <w:szCs w:val="24"/>
-          <w:lang w:val="en-IL"/>
         </w:rPr>
         <w:t>HFCE</w:t>
       </w:r>
@@ -827,7 +746,6 @@
           <w:rFonts w:asciiTheme="majorBidi" w:hAnsiTheme="majorBidi" w:cstheme="majorBidi"/>
           <w:sz w:val="24"/>
           <w:szCs w:val="24"/>
-          <w:lang w:val="en-IL"/>
         </w:rPr>
         <w:t>: Final consumption expenditure of households.​</w:t>
       </w:r>
@@ -838,7 +756,6 @@
             <w:rFonts w:asciiTheme="majorBidi" w:hAnsiTheme="majorBidi" w:cstheme="majorBidi"/>
             <w:sz w:val="24"/>
             <w:szCs w:val="24"/>
-            <w:lang w:val="en-IL"/>
           </w:rPr>
           <w:t>OECD Stats+6OECD Stats+6CEPAL+6</w:t>
         </w:r>
@@ -851,15 +768,13 @@
           <w:rFonts w:asciiTheme="majorBidi" w:hAnsiTheme="majorBidi" w:cstheme="majorBidi"/>
           <w:sz w:val="24"/>
           <w:szCs w:val="24"/>
-          <w:lang w:val="en-IL"/>
-        </w:rPr>
-      </w:pPr>
-      <w:r>
-        <w:rPr>
-          <w:rFonts w:asciiTheme="majorBidi" w:hAnsiTheme="majorBidi" w:cstheme="majorBidi"/>
-          <w:sz w:val="24"/>
-          <w:szCs w:val="24"/>
-          <w:lang w:val="en-IL"/>
+        </w:rPr>
+      </w:pPr>
+      <w:r>
+        <w:rPr>
+          <w:rFonts w:asciiTheme="majorBidi" w:hAnsiTheme="majorBidi" w:cstheme="majorBidi"/>
+          <w:sz w:val="24"/>
+          <w:szCs w:val="24"/>
         </w:rPr>
         <w:t xml:space="preserve">  </w:t>
       </w:r>
@@ -870,7 +785,6 @@
           <w:bCs/>
           <w:sz w:val="24"/>
           <w:szCs w:val="24"/>
-          <w:lang w:val="en-IL"/>
         </w:rPr>
         <w:t>NPISH</w:t>
       </w:r>
@@ -879,7 +793,6 @@
           <w:rFonts w:asciiTheme="majorBidi" w:hAnsiTheme="majorBidi" w:cstheme="majorBidi"/>
           <w:sz w:val="24"/>
           <w:szCs w:val="24"/>
-          <w:lang w:val="en-IL"/>
         </w:rPr>
         <w:t>: Final consumption expenditure of non-profit institutions serving households.​</w:t>
       </w:r>
@@ -890,7 +803,6 @@
             <w:rFonts w:asciiTheme="majorBidi" w:hAnsiTheme="majorBidi" w:cstheme="majorBidi"/>
             <w:sz w:val="24"/>
             <w:szCs w:val="24"/>
-            <w:lang w:val="en-IL"/>
           </w:rPr>
           <w:t>OECD Stats+1OECD+1</w:t>
         </w:r>
@@ -903,15 +815,13 @@
           <w:rFonts w:asciiTheme="majorBidi" w:hAnsiTheme="majorBidi" w:cstheme="majorBidi"/>
           <w:sz w:val="24"/>
           <w:szCs w:val="24"/>
-          <w:lang w:val="en-IL"/>
-        </w:rPr>
-      </w:pPr>
-      <w:r>
-        <w:rPr>
-          <w:rFonts w:asciiTheme="majorBidi" w:hAnsiTheme="majorBidi" w:cstheme="majorBidi"/>
-          <w:sz w:val="24"/>
-          <w:szCs w:val="24"/>
-          <w:lang w:val="en-IL"/>
+        </w:rPr>
+      </w:pPr>
+      <w:r>
+        <w:rPr>
+          <w:rFonts w:asciiTheme="majorBidi" w:hAnsiTheme="majorBidi" w:cstheme="majorBidi"/>
+          <w:sz w:val="24"/>
+          <w:szCs w:val="24"/>
         </w:rPr>
         <w:t xml:space="preserve">  </w:t>
       </w:r>
@@ -922,7 +832,6 @@
           <w:bCs/>
           <w:sz w:val="24"/>
           <w:szCs w:val="24"/>
-          <w:lang w:val="en-IL"/>
         </w:rPr>
         <w:t>GGFC</w:t>
       </w:r>
@@ -931,7 +840,6 @@
           <w:rFonts w:asciiTheme="majorBidi" w:hAnsiTheme="majorBidi" w:cstheme="majorBidi"/>
           <w:sz w:val="24"/>
           <w:szCs w:val="24"/>
-          <w:lang w:val="en-IL"/>
         </w:rPr>
         <w:t>: Final consumption expenditure of general government.​</w:t>
       </w:r>
@@ -942,7 +850,6 @@
             <w:rFonts w:asciiTheme="majorBidi" w:hAnsiTheme="majorBidi" w:cstheme="majorBidi"/>
             <w:sz w:val="24"/>
             <w:szCs w:val="24"/>
-            <w:lang w:val="en-IL"/>
           </w:rPr>
           <w:t>OECD Stats</w:t>
         </w:r>
@@ -955,15 +862,13 @@
           <w:rFonts w:asciiTheme="majorBidi" w:hAnsiTheme="majorBidi" w:cstheme="majorBidi"/>
           <w:sz w:val="24"/>
           <w:szCs w:val="24"/>
-          <w:lang w:val="en-IL"/>
-        </w:rPr>
-      </w:pPr>
-      <w:r>
-        <w:rPr>
-          <w:rFonts w:asciiTheme="majorBidi" w:hAnsiTheme="majorBidi" w:cstheme="majorBidi"/>
-          <w:sz w:val="24"/>
-          <w:szCs w:val="24"/>
-          <w:lang w:val="en-IL"/>
+        </w:rPr>
+      </w:pPr>
+      <w:r>
+        <w:rPr>
+          <w:rFonts w:asciiTheme="majorBidi" w:hAnsiTheme="majorBidi" w:cstheme="majorBidi"/>
+          <w:sz w:val="24"/>
+          <w:szCs w:val="24"/>
         </w:rPr>
         <w:t xml:space="preserve">  </w:t>
       </w:r>
@@ -974,7 +879,6 @@
           <w:bCs/>
           <w:sz w:val="24"/>
           <w:szCs w:val="24"/>
-          <w:lang w:val="en-IL"/>
         </w:rPr>
         <w:t>GFCF</w:t>
       </w:r>
@@ -983,7 +887,6 @@
           <w:rFonts w:asciiTheme="majorBidi" w:hAnsiTheme="majorBidi" w:cstheme="majorBidi"/>
           <w:sz w:val="24"/>
           <w:szCs w:val="24"/>
-          <w:lang w:val="en-IL"/>
         </w:rPr>
         <w:t>: Gross fixed capital formation.​</w:t>
       </w:r>
@@ -994,7 +897,6 @@
             <w:rFonts w:asciiTheme="majorBidi" w:hAnsiTheme="majorBidi" w:cstheme="majorBidi"/>
             <w:sz w:val="24"/>
             <w:szCs w:val="24"/>
-            <w:lang w:val="en-IL"/>
           </w:rPr>
           <w:t>OECD Stats+1CEPAL+1</w:t>
         </w:r>
@@ -1007,15 +909,13 @@
           <w:rFonts w:asciiTheme="majorBidi" w:hAnsiTheme="majorBidi" w:cstheme="majorBidi"/>
           <w:sz w:val="24"/>
           <w:szCs w:val="24"/>
-          <w:lang w:val="en-IL"/>
-        </w:rPr>
-      </w:pPr>
-      <w:r>
-        <w:rPr>
-          <w:rFonts w:asciiTheme="majorBidi" w:hAnsiTheme="majorBidi" w:cstheme="majorBidi"/>
-          <w:sz w:val="24"/>
-          <w:szCs w:val="24"/>
-          <w:lang w:val="en-IL"/>
+        </w:rPr>
+      </w:pPr>
+      <w:r>
+        <w:rPr>
+          <w:rFonts w:asciiTheme="majorBidi" w:hAnsiTheme="majorBidi" w:cstheme="majorBidi"/>
+          <w:sz w:val="24"/>
+          <w:szCs w:val="24"/>
         </w:rPr>
         <w:t xml:space="preserve">  </w:t>
       </w:r>
@@ -1026,7 +926,6 @@
           <w:bCs/>
           <w:sz w:val="24"/>
           <w:szCs w:val="24"/>
-          <w:lang w:val="en-IL"/>
         </w:rPr>
         <w:t>INVNT</w:t>
       </w:r>
@@ -1035,7 +934,6 @@
           <w:rFonts w:asciiTheme="majorBidi" w:hAnsiTheme="majorBidi" w:cstheme="majorBidi"/>
           <w:sz w:val="24"/>
           <w:szCs w:val="24"/>
-          <w:lang w:val="en-IL"/>
         </w:rPr>
         <w:t>: Changes in inventories.​</w:t>
       </w:r>
@@ -1046,7 +944,6 @@
             <w:rFonts w:asciiTheme="majorBidi" w:hAnsiTheme="majorBidi" w:cstheme="majorBidi"/>
             <w:sz w:val="24"/>
             <w:szCs w:val="24"/>
-            <w:lang w:val="en-IL"/>
           </w:rPr>
           <w:t>OECD Stats+4OECD Stats+4OECD+4</w:t>
         </w:r>
@@ -1059,15 +956,13 @@
           <w:rFonts w:asciiTheme="majorBidi" w:hAnsiTheme="majorBidi" w:cstheme="majorBidi"/>
           <w:sz w:val="24"/>
           <w:szCs w:val="24"/>
-          <w:lang w:val="en-IL"/>
-        </w:rPr>
-      </w:pPr>
-      <w:r>
-        <w:rPr>
-          <w:rFonts w:asciiTheme="majorBidi" w:hAnsiTheme="majorBidi" w:cstheme="majorBidi"/>
-          <w:sz w:val="24"/>
-          <w:szCs w:val="24"/>
-          <w:lang w:val="en-IL"/>
+        </w:rPr>
+      </w:pPr>
+      <w:r>
+        <w:rPr>
+          <w:rFonts w:asciiTheme="majorBidi" w:hAnsiTheme="majorBidi" w:cstheme="majorBidi"/>
+          <w:sz w:val="24"/>
+          <w:szCs w:val="24"/>
         </w:rPr>
         <w:t xml:space="preserve">  </w:t>
       </w:r>
@@ -1078,7 +973,6 @@
           <w:bCs/>
           <w:sz w:val="24"/>
           <w:szCs w:val="24"/>
-          <w:lang w:val="en-IL"/>
         </w:rPr>
         <w:t>DPABR</w:t>
       </w:r>
@@ -1087,7 +981,6 @@
           <w:rFonts w:asciiTheme="majorBidi" w:hAnsiTheme="majorBidi" w:cstheme="majorBidi"/>
           <w:sz w:val="24"/>
           <w:szCs w:val="24"/>
-          <w:lang w:val="en-IL"/>
         </w:rPr>
         <w:t>: Direct purchases abroad by residents (imports).​</w:t>
       </w:r>
@@ -1098,7 +991,6 @@
             <w:rFonts w:asciiTheme="majorBidi" w:hAnsiTheme="majorBidi" w:cstheme="majorBidi"/>
             <w:sz w:val="24"/>
             <w:szCs w:val="24"/>
-            <w:lang w:val="en-IL"/>
           </w:rPr>
           <w:t>OECD Stats+5OECD Stats+5CEPAL+5</w:t>
         </w:r>
@@ -1111,15 +1003,13 @@
           <w:rFonts w:asciiTheme="majorBidi" w:hAnsiTheme="majorBidi" w:cstheme="majorBidi"/>
           <w:sz w:val="24"/>
           <w:szCs w:val="24"/>
-          <w:lang w:val="en-IL"/>
-        </w:rPr>
-      </w:pPr>
-      <w:r>
-        <w:rPr>
-          <w:rFonts w:asciiTheme="majorBidi" w:hAnsiTheme="majorBidi" w:cstheme="majorBidi"/>
-          <w:sz w:val="24"/>
-          <w:szCs w:val="24"/>
-          <w:lang w:val="en-IL"/>
+        </w:rPr>
+      </w:pPr>
+      <w:r>
+        <w:rPr>
+          <w:rFonts w:asciiTheme="majorBidi" w:hAnsiTheme="majorBidi" w:cstheme="majorBidi"/>
+          <w:sz w:val="24"/>
+          <w:szCs w:val="24"/>
         </w:rPr>
         <w:t xml:space="preserve">  </w:t>
       </w:r>
@@ -1130,7 +1020,6 @@
           <w:bCs/>
           <w:sz w:val="24"/>
           <w:szCs w:val="24"/>
-          <w:lang w:val="en-IL"/>
         </w:rPr>
         <w:t>CONS_NONRES</w:t>
       </w:r>
@@ -1139,7 +1028,6 @@
           <w:rFonts w:asciiTheme="majorBidi" w:hAnsiTheme="majorBidi" w:cstheme="majorBidi"/>
           <w:sz w:val="24"/>
           <w:szCs w:val="24"/>
-          <w:lang w:val="en-IL"/>
         </w:rPr>
         <w:t>: Direct purchases by non-residents (exports).​</w:t>
       </w:r>
@@ -1150,7 +1038,6 @@
             <w:rFonts w:asciiTheme="majorBidi" w:hAnsiTheme="majorBidi" w:cstheme="majorBidi"/>
             <w:sz w:val="24"/>
             <w:szCs w:val="24"/>
-            <w:lang w:val="en-IL"/>
           </w:rPr>
           <w:t>OECD Stats+1CEPAL+1</w:t>
         </w:r>
@@ -1163,15 +1050,13 @@
           <w:rFonts w:asciiTheme="majorBidi" w:hAnsiTheme="majorBidi" w:cstheme="majorBidi"/>
           <w:sz w:val="24"/>
           <w:szCs w:val="24"/>
-          <w:lang w:val="en-IL"/>
-        </w:rPr>
-      </w:pPr>
-      <w:r>
-        <w:rPr>
-          <w:rFonts w:asciiTheme="majorBidi" w:hAnsiTheme="majorBidi" w:cstheme="majorBidi"/>
-          <w:sz w:val="24"/>
-          <w:szCs w:val="24"/>
-          <w:lang w:val="en-IL"/>
+        </w:rPr>
+      </w:pPr>
+      <w:r>
+        <w:rPr>
+          <w:rFonts w:asciiTheme="majorBidi" w:hAnsiTheme="majorBidi" w:cstheme="majorBidi"/>
+          <w:sz w:val="24"/>
+          <w:szCs w:val="24"/>
         </w:rPr>
         <w:t xml:space="preserve">  </w:t>
       </w:r>
@@ -1182,7 +1067,6 @@
           <w:bCs/>
           <w:sz w:val="24"/>
           <w:szCs w:val="24"/>
-          <w:lang w:val="en-IL"/>
         </w:rPr>
         <w:t>EXPO</w:t>
       </w:r>
@@ -1191,7 +1075,6 @@
           <w:rFonts w:asciiTheme="majorBidi" w:hAnsiTheme="majorBidi" w:cstheme="majorBidi"/>
           <w:sz w:val="24"/>
           <w:szCs w:val="24"/>
-          <w:lang w:val="en-IL"/>
         </w:rPr>
         <w:t>: Exports (cross-border).​</w:t>
       </w:r>
@@ -1202,7 +1085,6 @@
             <w:rFonts w:asciiTheme="majorBidi" w:hAnsiTheme="majorBidi" w:cstheme="majorBidi"/>
             <w:sz w:val="24"/>
             <w:szCs w:val="24"/>
-            <w:lang w:val="en-IL"/>
           </w:rPr>
           <w:t>OECD Stats+6OECD Stats+6CEPAL+6</w:t>
         </w:r>
@@ -1215,15 +1097,13 @@
           <w:rFonts w:asciiTheme="majorBidi" w:hAnsiTheme="majorBidi" w:cstheme="majorBidi"/>
           <w:sz w:val="24"/>
           <w:szCs w:val="24"/>
-          <w:lang w:val="en-IL"/>
-        </w:rPr>
-      </w:pPr>
-      <w:r>
-        <w:rPr>
-          <w:rFonts w:asciiTheme="majorBidi" w:hAnsiTheme="majorBidi" w:cstheme="majorBidi"/>
-          <w:sz w:val="24"/>
-          <w:szCs w:val="24"/>
-          <w:lang w:val="en-IL"/>
+        </w:rPr>
+      </w:pPr>
+      <w:r>
+        <w:rPr>
+          <w:rFonts w:asciiTheme="majorBidi" w:hAnsiTheme="majorBidi" w:cstheme="majorBidi"/>
+          <w:sz w:val="24"/>
+          <w:szCs w:val="24"/>
         </w:rPr>
         <w:t xml:space="preserve">  </w:t>
       </w:r>
@@ -1234,7 +1114,6 @@
           <w:bCs/>
           <w:sz w:val="24"/>
           <w:szCs w:val="24"/>
-          <w:lang w:val="en-IL"/>
         </w:rPr>
         <w:t>IMPO</w:t>
       </w:r>
@@ -1243,7 +1122,6 @@
           <w:rFonts w:asciiTheme="majorBidi" w:hAnsiTheme="majorBidi" w:cstheme="majorBidi"/>
           <w:sz w:val="24"/>
           <w:szCs w:val="24"/>
-          <w:lang w:val="en-IL"/>
         </w:rPr>
         <w:t>: Imports (cross-border).​</w:t>
       </w:r>
@@ -1254,7 +1132,6 @@
             <w:rFonts w:asciiTheme="majorBidi" w:hAnsiTheme="majorBidi" w:cstheme="majorBidi"/>
             <w:sz w:val="24"/>
             <w:szCs w:val="24"/>
-            <w:lang w:val="en-IL"/>
           </w:rPr>
           <w:t>OECD+6OECD Stats+6OECD+6</w:t>
         </w:r>
@@ -1275,7 +1152,6 @@
           <w:rFonts w:asciiTheme="majorBidi" w:hAnsiTheme="majorBidi" w:cstheme="majorBidi"/>
           <w:sz w:val="24"/>
           <w:szCs w:val="24"/>
-          <w:lang w:val="en-IL"/>
         </w:rPr>
         <w:t xml:space="preserve">  </w:t>
       </w:r>
@@ -1286,7 +1162,6 @@
           <w:bCs/>
           <w:sz w:val="24"/>
           <w:szCs w:val="24"/>
-          <w:lang w:val="en-IL"/>
         </w:rPr>
         <w:t>TOTAL</w:t>
       </w:r>
@@ -1295,7 +1170,6 @@
           <w:rFonts w:asciiTheme="majorBidi" w:hAnsiTheme="majorBidi" w:cstheme="majorBidi"/>
           <w:sz w:val="24"/>
           <w:szCs w:val="24"/>
-          <w:lang w:val="en-IL"/>
         </w:rPr>
         <w:t>: Total final demand.​</w:t>
       </w:r>
@@ -1306,7 +1180,6 @@
             <w:rFonts w:asciiTheme="majorBidi" w:hAnsiTheme="majorBidi" w:cstheme="majorBidi"/>
             <w:sz w:val="24"/>
             <w:szCs w:val="24"/>
-            <w:lang w:val="en-IL"/>
           </w:rPr>
           <w:t>OECD+6OECD+6</w:t>
         </w:r>
@@ -1368,45 +1241,139 @@
           <w:szCs w:val="24"/>
         </w:rPr>
       </w:pPr>
-    </w:p>
-    <w:p>
-      <w:pPr>
-        <w:spacing w:after="0"/>
-        <w:rPr>
-          <w:rFonts w:asciiTheme="majorBidi" w:hAnsiTheme="majorBidi" w:cstheme="majorBidi"/>
-          <w:sz w:val="24"/>
-          <w:szCs w:val="24"/>
-        </w:rPr>
-      </w:pPr>
-    </w:p>
-    <w:p>
-      <w:pPr>
-        <w:spacing w:after="0"/>
-        <w:rPr>
-          <w:rFonts w:asciiTheme="majorBidi" w:hAnsiTheme="majorBidi" w:cstheme="majorBidi"/>
-          <w:sz w:val="24"/>
-          <w:szCs w:val="24"/>
-        </w:rPr>
-      </w:pPr>
-    </w:p>
-    <w:p>
-      <w:pPr>
-        <w:spacing w:after="0"/>
-        <w:rPr>
-          <w:rFonts w:asciiTheme="majorBidi" w:hAnsiTheme="majorBidi" w:cstheme="majorBidi"/>
-          <w:sz w:val="24"/>
-          <w:szCs w:val="24"/>
-        </w:rPr>
-      </w:pPr>
-    </w:p>
-    <w:p>
-      <w:pPr>
-        <w:spacing w:after="0"/>
-        <w:rPr>
-          <w:rFonts w:asciiTheme="majorBidi" w:hAnsiTheme="majorBidi" w:cstheme="majorBidi"/>
-          <w:sz w:val="24"/>
-          <w:szCs w:val="24"/>
-          <w:lang w:val="en-IL"/>
+      <w:r>
+        <w:rPr>
+          <w:rFonts w:asciiTheme="majorBidi" w:hAnsiTheme="majorBidi" w:cstheme="majorBidi"/>
+          <w:sz w:val="24"/>
+          <w:szCs w:val="24"/>
+        </w:rPr>
+        <w:t>Salaries data from OECD:</w:t>
+      </w:r>
+    </w:p>
+    <w:p>
+      <w:pPr>
+        <w:spacing w:after="0"/>
+        <w:rPr>
+          <w:rFonts w:asciiTheme="majorBidi" w:hAnsiTheme="majorBidi" w:cstheme="majorBidi"/>
+          <w:sz w:val="24"/>
+          <w:szCs w:val="24"/>
+        </w:rPr>
+      </w:pPr>
+      <w:r>
+        <w:rPr>
+          <w:rFonts w:asciiTheme="majorBidi" w:hAnsiTheme="majorBidi" w:cstheme="majorBidi"/>
+          <w:sz w:val="24"/>
+          <w:szCs w:val="24"/>
+          <w:highlight w:val="yellow"/>
+        </w:rPr>
+        <w:t>C:\NavitComputer24\2024_NES\Economics\Data\from_OECD</w:t>
+      </w:r>
+      <w:r>
+        <w:rPr>
+          <w:rFonts w:asciiTheme="majorBidi" w:hAnsiTheme="majorBidi" w:cstheme="majorBidi"/>
+          <w:sz w:val="24"/>
+          <w:szCs w:val="24"/>
+          <w:highlight w:val="yellow"/>
+        </w:rPr>
+        <w:t>\</w:t>
+      </w:r>
+    </w:p>
+    <w:p>
+      <w:pPr>
+        <w:spacing w:after="0"/>
+        <w:rPr>
+          <w:rFonts w:asciiTheme="majorBidi" w:hAnsiTheme="majorBidi" w:cstheme="majorBidi"/>
+          <w:color w:val="008000"/>
+          <w:sz w:val="24"/>
+          <w:szCs w:val="24"/>
+        </w:rPr>
+      </w:pPr>
+      <w:r>
+        <w:rPr>
+          <w:rFonts w:asciiTheme="majorBidi" w:hAnsiTheme="majorBidi" w:cstheme="majorBidi"/>
+          <w:color w:val="008000"/>
+          <w:sz w:val="24"/>
+          <w:szCs w:val="24"/>
+        </w:rPr>
+        <w:t>UTF-8OECD - XY Rates.csv</w:t>
+      </w:r>
+    </w:p>
+    <w:p>
+      <w:pPr>
+        <w:spacing w:after="0"/>
+        <w:rPr>
+          <w:rFonts w:asciiTheme="majorBidi" w:hAnsiTheme="majorBidi" w:cstheme="majorBidi"/>
+          <w:sz w:val="24"/>
+          <w:szCs w:val="24"/>
+        </w:rPr>
+      </w:pPr>
+      <w:r>
+        <w:rPr>
+          <w:rFonts w:asciiTheme="majorBidi" w:hAnsiTheme="majorBidi" w:cstheme="majorBidi"/>
+          <w:color w:val="008000"/>
+          <w:sz w:val="24"/>
+          <w:szCs w:val="24"/>
+        </w:rPr>
+        <w:t>UTF-8SUT Use, Value added and its components by activity.csv</w:t>
+      </w:r>
+    </w:p>
+    <w:p>
+      <w:pPr>
+        <w:spacing w:after="0"/>
+        <w:rPr>
+          <w:rFonts w:asciiTheme="majorBidi" w:hAnsiTheme="majorBidi" w:cstheme="majorBidi"/>
+          <w:sz w:val="24"/>
+          <w:szCs w:val="24"/>
+        </w:rPr>
+      </w:pPr>
+    </w:p>
+    <w:p>
+      <w:pPr>
+        <w:spacing w:after="0"/>
+        <w:rPr>
+          <w:rFonts w:asciiTheme="majorBidi" w:hAnsiTheme="majorBidi" w:cstheme="majorBidi"/>
+          <w:sz w:val="24"/>
+          <w:szCs w:val="24"/>
+        </w:rPr>
+      </w:pPr>
+    </w:p>
+    <w:p>
+      <w:pPr>
+        <w:spacing w:after="0"/>
+        <w:rPr>
+          <w:rFonts w:asciiTheme="majorBidi" w:hAnsiTheme="majorBidi" w:cstheme="majorBidi"/>
+          <w:sz w:val="24"/>
+          <w:szCs w:val="24"/>
+        </w:rPr>
+      </w:pPr>
+    </w:p>
+    <w:p>
+      <w:pPr>
+        <w:spacing w:after="0"/>
+        <w:rPr>
+          <w:rFonts w:asciiTheme="majorBidi" w:hAnsiTheme="majorBidi" w:cstheme="majorBidi"/>
+          <w:sz w:val="24"/>
+          <w:szCs w:val="24"/>
+        </w:rPr>
+      </w:pPr>
+    </w:p>
+    <w:p>
+      <w:pPr>
+        <w:spacing w:after="0"/>
+        <w:rPr>
+          <w:rFonts w:asciiTheme="majorBidi" w:hAnsiTheme="majorBidi" w:cstheme="majorBidi"/>
+          <w:sz w:val="24"/>
+          <w:szCs w:val="24"/>
+        </w:rPr>
+      </w:pPr>
+    </w:p>
+    <w:p>
+      <w:pPr>
+        <w:spacing w:after="0"/>
+        <w:rPr>
+          <w:rFonts w:asciiTheme="majorBidi" w:hAnsiTheme="majorBidi" w:cstheme="majorBidi"/>
+          <w:sz w:val="24"/>
+          <w:szCs w:val="24"/>
         </w:rPr>
       </w:pPr>
     </w:p>
@@ -2032,6 +1999,7 @@
   <w:style w:type="character" w:default="1" w:styleId="DefaultParagraphFont">
     <w:name w:val="Default Paragraph Font"/>
     <w:uiPriority w:val="1"/>
+    <w:semiHidden/>
     <w:unhideWhenUsed/>
   </w:style>
   <w:style w:type="table" w:default="1" w:styleId="TableNormal">

</xml_diff>

<commit_message>
impact_multipliers - printing only the multipliers. predict_impacts - multipliers multiplied fy final demand
</commit_message>
<xml_diff>
--- a/OECD data.docx
+++ b/OECD data.docx
@@ -2,680 +2,6 @@
 <file path=word/document.xml><?xml version="1.0" encoding="utf-8"?>
 <w:document xmlns:wpc="http://schemas.microsoft.com/office/word/2010/wordprocessingCanvas" xmlns:cx="http://schemas.microsoft.com/office/drawing/2014/chartex" xmlns:cx1="http://schemas.microsoft.com/office/drawing/2015/9/8/chartex" xmlns:cx2="http://schemas.microsoft.com/office/drawing/2015/10/21/chartex" xmlns:cx3="http://schemas.microsoft.com/office/drawing/2016/5/9/chartex" xmlns:cx4="http://schemas.microsoft.com/office/drawing/2016/5/10/chartex" xmlns:cx5="http://schemas.microsoft.com/office/drawing/2016/5/11/chartex" xmlns:cx6="http://schemas.microsoft.com/office/drawing/2016/5/12/chartex" xmlns:cx7="http://schemas.microsoft.com/office/drawing/2016/5/13/chartex" xmlns:cx8="http://schemas.microsoft.com/office/drawing/2016/5/14/chartex" xmlns:mc="http://schemas.openxmlformats.org/markup-compatibility/2006" xmlns:aink="http://schemas.microsoft.com/office/drawing/2016/ink" xmlns:am3d="http://schemas.microsoft.com/office/drawing/2017/model3d" xmlns:o="urn:schemas-microsoft-com:office:office" xmlns:oel="http://schemas.microsoft.com/office/2019/extlst" xmlns:r="http://schemas.openxmlformats.org/officeDocument/2006/relationships" xmlns:m="http://schemas.openxmlformats.org/officeDocument/2006/math" xmlns:v="urn:schemas-microsoft-com:vml" xmlns:wp14="http://schemas.microsoft.com/office/word/2010/wordprocessingDrawing" xmlns:wp="http://schemas.openxmlformats.org/drawingml/2006/wordprocessingDrawing" xmlns:w10="urn:schemas-microsoft-com:office:word" xmlns:w="http://schemas.openxmlformats.org/wordprocessingml/2006/main" xmlns:w14="http://schemas.microsoft.com/office/word/2010/wordml" xmlns:w15="http://schemas.microsoft.com/office/word/2012/wordml" xmlns:w16cex="http://schemas.microsoft.com/office/word/2018/wordml/cex" xmlns:w16cid="http://schemas.microsoft.com/office/word/2016/wordml/cid" xmlns:w16="http://schemas.microsoft.com/office/word/2018/wordml" xmlns:w16sdtdh="http://schemas.microsoft.com/office/word/2020/wordml/sdtdatahash" xmlns:w16se="http://schemas.microsoft.com/office/word/2015/wordml/symex" xmlns:wpg="http://schemas.microsoft.com/office/word/2010/wordprocessingGroup" xmlns:wpi="http://schemas.microsoft.com/office/word/2010/wordprocessingInk" xmlns:wne="http://schemas.microsoft.com/office/word/2006/wordml" xmlns:wps="http://schemas.microsoft.com/office/word/2010/wordprocessingShape" mc:Ignorable="w14 w15 w16se w16cid w16 w16cex w16sdtdh wp14">
   <w:body>
-    <w:p>
-      <w:pPr>
-        <w:spacing w:after="0"/>
-        <w:rPr>
-          <w:rFonts w:asciiTheme="majorBidi" w:hAnsiTheme="majorBidi" w:cstheme="majorBidi"/>
-          <w:sz w:val="24"/>
-          <w:szCs w:val="24"/>
-        </w:rPr>
-      </w:pPr>
-      <w:r>
-        <w:rPr>
-          <w:rFonts w:asciiTheme="majorBidi" w:hAnsiTheme="majorBidi" w:cstheme="majorBidi"/>
-          <w:sz w:val="24"/>
-          <w:szCs w:val="24"/>
-        </w:rPr>
-        <w:t>OECD from data:</w:t>
-      </w:r>
-    </w:p>
-    <w:p>
-      <w:pPr>
-        <w:spacing w:after="0"/>
-        <w:rPr>
-          <w:rFonts w:asciiTheme="majorBidi" w:hAnsiTheme="majorBidi" w:cstheme="majorBidi"/>
-          <w:sz w:val="24"/>
-          <w:szCs w:val="24"/>
-        </w:rPr>
-      </w:pPr>
-      <w:proofErr w:type="spellStart"/>
-      <w:r>
-        <w:rPr>
-          <w:rFonts w:asciiTheme="majorBidi" w:hAnsiTheme="majorBidi" w:cstheme="majorBidi"/>
-          <w:sz w:val="24"/>
-          <w:szCs w:val="24"/>
-        </w:rPr>
-        <w:t>F_total</w:t>
-      </w:r>
-      <w:proofErr w:type="spellEnd"/>
-      <w:r>
-        <w:rPr>
-          <w:rFonts w:asciiTheme="majorBidi" w:hAnsiTheme="majorBidi" w:cstheme="majorBidi"/>
-          <w:sz w:val="24"/>
-          <w:szCs w:val="24"/>
-        </w:rPr>
-        <w:t xml:space="preserve"> = </w:t>
-      </w:r>
-    </w:p>
-    <w:p>
-      <w:pPr>
-        <w:spacing w:after="0"/>
-        <w:rPr>
-          <w:rFonts w:asciiTheme="majorBidi" w:hAnsiTheme="majorBidi" w:cstheme="majorBidi"/>
-          <w:sz w:val="24"/>
-          <w:szCs w:val="24"/>
-        </w:rPr>
-      </w:pPr>
-      <w:proofErr w:type="spellStart"/>
-      <w:r>
-        <w:rPr>
-          <w:rFonts w:asciiTheme="majorBidi" w:hAnsiTheme="majorBidi" w:cstheme="majorBidi"/>
-          <w:sz w:val="24"/>
-          <w:szCs w:val="24"/>
-        </w:rPr>
-        <w:t>f_row_sums</w:t>
-      </w:r>
-      <w:proofErr w:type="spellEnd"/>
-      <w:r>
-        <w:rPr>
-          <w:rFonts w:asciiTheme="majorBidi" w:hAnsiTheme="majorBidi" w:cstheme="majorBidi"/>
-          <w:sz w:val="24"/>
-          <w:szCs w:val="24"/>
-        </w:rPr>
-        <w:t xml:space="preserve"> = </w:t>
-      </w:r>
-      <w:proofErr w:type="spellStart"/>
-      <w:r>
-        <w:rPr>
-          <w:rFonts w:asciiTheme="majorBidi" w:hAnsiTheme="majorBidi" w:cstheme="majorBidi"/>
-          <w:sz w:val="24"/>
-          <w:szCs w:val="24"/>
-        </w:rPr>
-        <w:t>OECD.loc</w:t>
-      </w:r>
-      <w:proofErr w:type="spellEnd"/>
-      <w:r>
-        <w:rPr>
-          <w:rFonts w:asciiTheme="majorBidi" w:hAnsiTheme="majorBidi" w:cstheme="majorBidi"/>
-          <w:sz w:val="24"/>
-          <w:szCs w:val="24"/>
-        </w:rPr>
-        <w:t>[:,['HFCE',    'NPISH',    'GGFC', 'GFCF', 'INVNT',    'DPABR',    'CONS_NONRES',  'EXPO', 'IMPO']].sum(axis=1)</w:t>
-      </w:r>
-    </w:p>
-    <w:p>
-      <w:pPr>
-        <w:spacing w:after="0"/>
-        <w:rPr>
-          <w:rFonts w:asciiTheme="majorBidi" w:hAnsiTheme="majorBidi" w:cstheme="majorBidi"/>
-          <w:sz w:val="24"/>
-          <w:szCs w:val="24"/>
-        </w:rPr>
-      </w:pPr>
-      <w:r>
-        <w:rPr>
-          <w:rFonts w:asciiTheme="majorBidi" w:hAnsiTheme="majorBidi" w:cstheme="majorBidi"/>
-          <w:sz w:val="24"/>
-          <w:szCs w:val="24"/>
-        </w:rPr>
-        <w:t>sum of household final demand</w:t>
-      </w:r>
-    </w:p>
-    <w:p>
-      <w:pPr>
-        <w:spacing w:after="0"/>
-        <w:rPr>
-          <w:rFonts w:asciiTheme="majorBidi" w:hAnsiTheme="majorBidi" w:cstheme="majorBidi"/>
-          <w:sz w:val="24"/>
-          <w:szCs w:val="24"/>
-        </w:rPr>
-      </w:pPr>
-    </w:p>
-    <w:p>
-      <w:pPr>
-        <w:spacing w:after="0"/>
-        <w:rPr>
-          <w:rFonts w:asciiTheme="majorBidi" w:hAnsiTheme="majorBidi" w:cstheme="majorBidi"/>
-          <w:sz w:val="24"/>
-          <w:szCs w:val="24"/>
-        </w:rPr>
-      </w:pPr>
-    </w:p>
-    <w:p>
-      <w:pPr>
-        <w:spacing w:after="0"/>
-        <w:rPr>
-          <w:rFonts w:asciiTheme="majorBidi" w:hAnsiTheme="majorBidi" w:cstheme="majorBidi"/>
-          <w:sz w:val="24"/>
-          <w:szCs w:val="24"/>
-        </w:rPr>
-      </w:pPr>
-    </w:p>
-    <w:p>
-      <w:pPr>
-        <w:spacing w:after="0"/>
-        <w:rPr>
-          <w:rFonts w:asciiTheme="majorBidi" w:hAnsiTheme="majorBidi" w:cstheme="majorBidi"/>
-          <w:sz w:val="24"/>
-          <w:szCs w:val="24"/>
-        </w:rPr>
-      </w:pPr>
-      <w:r>
-        <w:rPr>
-          <w:rFonts w:asciiTheme="majorBidi" w:hAnsiTheme="majorBidi" w:cstheme="majorBidi"/>
-          <w:sz w:val="24"/>
-          <w:szCs w:val="24"/>
-        </w:rPr>
-        <w:t>print()</w:t>
-      </w:r>
-    </w:p>
-    <w:p>
-      <w:pPr>
-        <w:spacing w:after="0"/>
-        <w:rPr>
-          <w:rFonts w:asciiTheme="majorBidi" w:hAnsiTheme="majorBidi" w:cstheme="majorBidi"/>
-          <w:sz w:val="24"/>
-          <w:szCs w:val="24"/>
-        </w:rPr>
-      </w:pPr>
-      <w:r>
-        <w:rPr>
-          <w:rFonts w:asciiTheme="majorBidi" w:hAnsiTheme="majorBidi" w:cstheme="majorBidi"/>
-          <w:sz w:val="24"/>
-          <w:szCs w:val="24"/>
-        </w:rPr>
-        <w:t xml:space="preserve">print( </w:t>
-      </w:r>
-      <w:proofErr w:type="spellStart"/>
-      <w:r>
-        <w:rPr>
-          <w:rFonts w:asciiTheme="majorBidi" w:hAnsiTheme="majorBidi" w:cstheme="majorBidi"/>
-          <w:sz w:val="24"/>
-          <w:szCs w:val="24"/>
-        </w:rPr>
-        <w:t>pd.DataFrame</w:t>
-      </w:r>
-      <w:proofErr w:type="spellEnd"/>
-      <w:r>
-        <w:rPr>
-          <w:rFonts w:asciiTheme="majorBidi" w:hAnsiTheme="majorBidi" w:cstheme="majorBidi"/>
-          <w:sz w:val="24"/>
-          <w:szCs w:val="24"/>
-        </w:rPr>
-        <w:t>({</w:t>
-      </w:r>
-    </w:p>
-    <w:p>
-      <w:pPr>
-        <w:spacing w:after="0"/>
-        <w:rPr>
-          <w:rFonts w:asciiTheme="majorBidi" w:hAnsiTheme="majorBidi" w:cstheme="majorBidi"/>
-          <w:sz w:val="24"/>
-          <w:szCs w:val="24"/>
-        </w:rPr>
-      </w:pPr>
-      <w:r>
-        <w:rPr>
-          <w:rFonts w:asciiTheme="majorBidi" w:hAnsiTheme="majorBidi" w:cstheme="majorBidi"/>
-          <w:sz w:val="24"/>
-          <w:szCs w:val="24"/>
-        </w:rPr>
-        <w:t>        'total': output,</w:t>
-      </w:r>
-    </w:p>
-    <w:p>
-      <w:pPr>
-        <w:spacing w:after="0"/>
-        <w:rPr>
-          <w:rFonts w:asciiTheme="majorBidi" w:hAnsiTheme="majorBidi" w:cstheme="majorBidi"/>
-          <w:sz w:val="24"/>
-          <w:szCs w:val="24"/>
-        </w:rPr>
-      </w:pPr>
-      <w:r>
-        <w:rPr>
-          <w:rFonts w:asciiTheme="majorBidi" w:hAnsiTheme="majorBidi" w:cstheme="majorBidi"/>
-          <w:sz w:val="24"/>
-          <w:szCs w:val="24"/>
-        </w:rPr>
-        <w:t xml:space="preserve">        'sum over columns': </w:t>
-      </w:r>
-      <w:proofErr w:type="spellStart"/>
-      <w:r>
-        <w:rPr>
-          <w:rFonts w:asciiTheme="majorBidi" w:hAnsiTheme="majorBidi" w:cstheme="majorBidi"/>
-          <w:sz w:val="24"/>
-          <w:szCs w:val="24"/>
-        </w:rPr>
-        <w:t>II.sum</w:t>
-      </w:r>
-      <w:proofErr w:type="spellEnd"/>
-      <w:r>
-        <w:rPr>
-          <w:rFonts w:asciiTheme="majorBidi" w:hAnsiTheme="majorBidi" w:cstheme="majorBidi"/>
-          <w:sz w:val="24"/>
-          <w:szCs w:val="24"/>
-        </w:rPr>
-        <w:t xml:space="preserve">(axis=1) + </w:t>
-      </w:r>
-      <w:proofErr w:type="spellStart"/>
-      <w:r>
-        <w:rPr>
-          <w:rFonts w:asciiTheme="majorBidi" w:hAnsiTheme="majorBidi" w:cstheme="majorBidi"/>
-          <w:sz w:val="24"/>
-          <w:szCs w:val="24"/>
-        </w:rPr>
-        <w:t>household_expenditure</w:t>
-      </w:r>
-      <w:proofErr w:type="spellEnd"/>
-      <w:r>
-        <w:rPr>
-          <w:rFonts w:asciiTheme="majorBidi" w:hAnsiTheme="majorBidi" w:cstheme="majorBidi"/>
-          <w:sz w:val="24"/>
-          <w:szCs w:val="24"/>
-        </w:rPr>
-        <w:t xml:space="preserve"> + </w:t>
-      </w:r>
-      <w:proofErr w:type="spellStart"/>
-      <w:r>
-        <w:rPr>
-          <w:rFonts w:asciiTheme="majorBidi" w:hAnsiTheme="majorBidi" w:cstheme="majorBidi"/>
-          <w:sz w:val="24"/>
-          <w:szCs w:val="24"/>
-        </w:rPr>
-        <w:t>other_final_demand.sum</w:t>
-      </w:r>
-      <w:proofErr w:type="spellEnd"/>
-      <w:r>
-        <w:rPr>
-          <w:rFonts w:asciiTheme="majorBidi" w:hAnsiTheme="majorBidi" w:cstheme="majorBidi"/>
-          <w:sz w:val="24"/>
-          <w:szCs w:val="24"/>
-        </w:rPr>
-        <w:t>(axis=1) ,</w:t>
-      </w:r>
-    </w:p>
-    <w:p>
-      <w:pPr>
-        <w:spacing w:after="0"/>
-        <w:rPr>
-          <w:rFonts w:asciiTheme="majorBidi" w:hAnsiTheme="majorBidi" w:cstheme="majorBidi"/>
-          <w:sz w:val="24"/>
-          <w:szCs w:val="24"/>
-        </w:rPr>
-      </w:pPr>
-      <w:r>
-        <w:rPr>
-          <w:rFonts w:asciiTheme="majorBidi" w:hAnsiTheme="majorBidi" w:cstheme="majorBidi"/>
-          <w:sz w:val="24"/>
-          <w:szCs w:val="24"/>
-        </w:rPr>
-        <w:t xml:space="preserve">        'sum over rows - small': </w:t>
-      </w:r>
-      <w:proofErr w:type="spellStart"/>
-      <w:r>
-        <w:rPr>
-          <w:rFonts w:asciiTheme="majorBidi" w:hAnsiTheme="majorBidi" w:cstheme="majorBidi"/>
-          <w:sz w:val="24"/>
-          <w:szCs w:val="24"/>
-        </w:rPr>
-        <w:t>II.sum</w:t>
-      </w:r>
-      <w:proofErr w:type="spellEnd"/>
-      <w:r>
-        <w:rPr>
-          <w:rFonts w:asciiTheme="majorBidi" w:hAnsiTheme="majorBidi" w:cstheme="majorBidi"/>
-          <w:sz w:val="24"/>
-          <w:szCs w:val="24"/>
-        </w:rPr>
-        <w:t>(axis=0) + GDP,</w:t>
-      </w:r>
-    </w:p>
-    <w:p>
-      <w:pPr>
-        <w:spacing w:after="0"/>
-        <w:rPr>
-          <w:rFonts w:asciiTheme="majorBidi" w:hAnsiTheme="majorBidi" w:cstheme="majorBidi"/>
-          <w:sz w:val="24"/>
-          <w:szCs w:val="24"/>
-        </w:rPr>
-      </w:pPr>
-      <w:r>
-        <w:rPr>
-          <w:rFonts w:asciiTheme="majorBidi" w:hAnsiTheme="majorBidi" w:cstheme="majorBidi"/>
-          <w:sz w:val="24"/>
-          <w:szCs w:val="24"/>
-        </w:rPr>
-        <w:t xml:space="preserve">        'sum over rows - </w:t>
-      </w:r>
-      <w:proofErr w:type="spellStart"/>
-      <w:r>
-        <w:rPr>
-          <w:rFonts w:asciiTheme="majorBidi" w:hAnsiTheme="majorBidi" w:cstheme="majorBidi"/>
-          <w:sz w:val="24"/>
-          <w:szCs w:val="24"/>
-        </w:rPr>
-        <w:t>OECD_rough</w:t>
-      </w:r>
-      <w:proofErr w:type="spellEnd"/>
-      <w:r>
-        <w:rPr>
-          <w:rFonts w:asciiTheme="majorBidi" w:hAnsiTheme="majorBidi" w:cstheme="majorBidi"/>
-          <w:sz w:val="24"/>
-          <w:szCs w:val="24"/>
-        </w:rPr>
-        <w:t xml:space="preserve">': </w:t>
-      </w:r>
-      <w:proofErr w:type="spellStart"/>
-      <w:r>
-        <w:rPr>
-          <w:rFonts w:asciiTheme="majorBidi" w:hAnsiTheme="majorBidi" w:cstheme="majorBidi"/>
-          <w:sz w:val="24"/>
-          <w:szCs w:val="24"/>
-        </w:rPr>
-        <w:t>OECD.loc</w:t>
-      </w:r>
-      <w:proofErr w:type="spellEnd"/>
-      <w:r>
-        <w:rPr>
-          <w:rFonts w:asciiTheme="majorBidi" w:hAnsiTheme="majorBidi" w:cstheme="majorBidi"/>
-          <w:sz w:val="24"/>
-          <w:szCs w:val="24"/>
-        </w:rPr>
-        <w:t xml:space="preserve">['A01_02':'T', </w:t>
-      </w:r>
-      <w:proofErr w:type="spellStart"/>
-      <w:r>
-        <w:rPr>
-          <w:rFonts w:asciiTheme="majorBidi" w:hAnsiTheme="majorBidi" w:cstheme="majorBidi"/>
-          <w:sz w:val="24"/>
-          <w:szCs w:val="24"/>
-        </w:rPr>
-        <w:t>simple_II_labels</w:t>
-      </w:r>
-      <w:proofErr w:type="spellEnd"/>
-      <w:r>
-        <w:rPr>
-          <w:rFonts w:asciiTheme="majorBidi" w:hAnsiTheme="majorBidi" w:cstheme="majorBidi"/>
-          <w:sz w:val="24"/>
-          <w:szCs w:val="24"/>
-        </w:rPr>
-        <w:t xml:space="preserve">].sum(axis=0) + GDP #+ </w:t>
-      </w:r>
-      <w:proofErr w:type="spellStart"/>
-      <w:r>
-        <w:rPr>
-          <w:rFonts w:asciiTheme="majorBidi" w:hAnsiTheme="majorBidi" w:cstheme="majorBidi"/>
-          <w:sz w:val="24"/>
-          <w:szCs w:val="24"/>
-        </w:rPr>
-        <w:t>OECD.loc</w:t>
-      </w:r>
-      <w:proofErr w:type="spellEnd"/>
-      <w:r>
-        <w:rPr>
-          <w:rFonts w:asciiTheme="majorBidi" w:hAnsiTheme="majorBidi" w:cstheme="majorBidi"/>
-          <w:sz w:val="24"/>
-          <w:szCs w:val="24"/>
-        </w:rPr>
-        <w:t>['TTL_INT_FNL',</w:t>
-      </w:r>
-      <w:proofErr w:type="spellStart"/>
-      <w:r>
-        <w:rPr>
-          <w:rFonts w:asciiTheme="majorBidi" w:hAnsiTheme="majorBidi" w:cstheme="majorBidi"/>
-          <w:sz w:val="24"/>
-          <w:szCs w:val="24"/>
-        </w:rPr>
-        <w:t>simple_II_labels</w:t>
-      </w:r>
-      <w:proofErr w:type="spellEnd"/>
-      <w:r>
-        <w:rPr>
-          <w:rFonts w:asciiTheme="majorBidi" w:hAnsiTheme="majorBidi" w:cstheme="majorBidi"/>
-          <w:sz w:val="24"/>
-          <w:szCs w:val="24"/>
-        </w:rPr>
-        <w:t>].sum(axis=0)</w:t>
-      </w:r>
-    </w:p>
-    <w:p>
-      <w:pPr>
-        <w:spacing w:after="0"/>
-        <w:rPr>
-          <w:rFonts w:asciiTheme="majorBidi" w:hAnsiTheme="majorBidi" w:cstheme="majorBidi"/>
-          <w:sz w:val="24"/>
-          <w:szCs w:val="24"/>
-        </w:rPr>
-      </w:pPr>
-      <w:r>
-        <w:rPr>
-          <w:rFonts w:asciiTheme="majorBidi" w:hAnsiTheme="majorBidi" w:cstheme="majorBidi"/>
-          <w:sz w:val="24"/>
-          <w:szCs w:val="24"/>
-        </w:rPr>
-        <w:t>})</w:t>
-      </w:r>
-    </w:p>
-    <w:p>
-      <w:pPr>
-        <w:spacing w:after="0"/>
-        <w:rPr>
-          <w:rFonts w:asciiTheme="majorBidi" w:hAnsiTheme="majorBidi" w:cstheme="majorBidi"/>
-          <w:sz w:val="24"/>
-          <w:szCs w:val="24"/>
-        </w:rPr>
-      </w:pPr>
-      <w:r>
-        <w:rPr>
-          <w:rFonts w:asciiTheme="majorBidi" w:hAnsiTheme="majorBidi" w:cstheme="majorBidi"/>
-          <w:sz w:val="24"/>
-          <w:szCs w:val="24"/>
-        </w:rPr>
-        <w:t>)</w:t>
-      </w:r>
-    </w:p>
-    <w:p>
-      <w:pPr>
-        <w:spacing w:after="0"/>
-        <w:rPr>
-          <w:rFonts w:asciiTheme="majorBidi" w:hAnsiTheme="majorBidi" w:cstheme="majorBidi"/>
-          <w:sz w:val="24"/>
-          <w:szCs w:val="24"/>
-        </w:rPr>
-      </w:pPr>
-      <w:r>
-        <w:rPr>
-          <w:rFonts w:asciiTheme="majorBidi" w:hAnsiTheme="majorBidi" w:cstheme="majorBidi"/>
-          <w:sz w:val="24"/>
-          <w:szCs w:val="24"/>
-        </w:rPr>
-        <w:t>I played with it but I cant’ calculate GDP – it is not a simple sum of GDP plus something equals input</w:t>
-      </w:r>
-    </w:p>
-    <w:p>
-      <w:pPr>
-        <w:spacing w:after="0"/>
-        <w:rPr>
-          <w:rFonts w:asciiTheme="majorBidi" w:hAnsiTheme="majorBidi" w:cstheme="majorBidi"/>
-          <w:sz w:val="24"/>
-          <w:szCs w:val="24"/>
-        </w:rPr>
-      </w:pPr>
-      <w:r>
-        <w:rPr>
-          <w:rFonts w:asciiTheme="majorBidi" w:hAnsiTheme="majorBidi" w:cstheme="majorBidi"/>
-          <w:sz w:val="24"/>
-          <w:szCs w:val="24"/>
-        </w:rPr>
-        <w:t>And GDP does not equal final demand</w:t>
-      </w:r>
-    </w:p>
-    <w:p>
-      <w:pPr>
-        <w:spacing w:after="0"/>
-        <w:rPr>
-          <w:rFonts w:asciiTheme="majorBidi" w:hAnsiTheme="majorBidi" w:cstheme="majorBidi"/>
-          <w:sz w:val="24"/>
-          <w:szCs w:val="24"/>
-        </w:rPr>
-      </w:pPr>
-    </w:p>
-    <w:p>
-      <w:pPr>
-        <w:spacing w:after="0"/>
-        <w:rPr>
-          <w:rFonts w:asciiTheme="majorBidi" w:hAnsiTheme="majorBidi" w:cstheme="majorBidi"/>
-          <w:sz w:val="24"/>
-          <w:szCs w:val="24"/>
-        </w:rPr>
-      </w:pPr>
-      <w:r>
-        <w:rPr>
-          <w:rFonts w:asciiTheme="majorBidi" w:hAnsiTheme="majorBidi" w:cstheme="majorBidi"/>
-          <w:sz w:val="24"/>
-          <w:szCs w:val="24"/>
-        </w:rPr>
-        <w:t xml:space="preserve">print( </w:t>
-      </w:r>
-      <w:proofErr w:type="spellStart"/>
-      <w:r>
-        <w:rPr>
-          <w:rFonts w:asciiTheme="majorBidi" w:hAnsiTheme="majorBidi" w:cstheme="majorBidi"/>
-          <w:sz w:val="24"/>
-          <w:szCs w:val="24"/>
-        </w:rPr>
-        <w:t>pd.DataFrame</w:t>
-      </w:r>
-      <w:proofErr w:type="spellEnd"/>
-      <w:r>
-        <w:rPr>
-          <w:rFonts w:asciiTheme="majorBidi" w:hAnsiTheme="majorBidi" w:cstheme="majorBidi"/>
-          <w:sz w:val="24"/>
-          <w:szCs w:val="24"/>
-        </w:rPr>
-        <w:t>({</w:t>
-      </w:r>
-    </w:p>
-    <w:p>
-      <w:pPr>
-        <w:spacing w:after="0"/>
-        <w:rPr>
-          <w:rFonts w:asciiTheme="majorBidi" w:hAnsiTheme="majorBidi" w:cstheme="majorBidi"/>
-          <w:sz w:val="24"/>
-          <w:szCs w:val="24"/>
-        </w:rPr>
-      </w:pPr>
-      <w:r>
-        <w:rPr>
-          <w:rFonts w:asciiTheme="majorBidi" w:hAnsiTheme="majorBidi" w:cstheme="majorBidi"/>
-          <w:sz w:val="24"/>
-          <w:szCs w:val="24"/>
-        </w:rPr>
-        <w:t xml:space="preserve">        'final demand': </w:t>
-      </w:r>
-      <w:proofErr w:type="spellStart"/>
-      <w:r>
-        <w:rPr>
-          <w:rFonts w:asciiTheme="majorBidi" w:hAnsiTheme="majorBidi" w:cstheme="majorBidi"/>
-          <w:sz w:val="24"/>
-          <w:szCs w:val="24"/>
-        </w:rPr>
-        <w:t>household_expenditure</w:t>
-      </w:r>
-      <w:proofErr w:type="spellEnd"/>
-      <w:r>
-        <w:rPr>
-          <w:rFonts w:asciiTheme="majorBidi" w:hAnsiTheme="majorBidi" w:cstheme="majorBidi"/>
-          <w:sz w:val="24"/>
-          <w:szCs w:val="24"/>
-        </w:rPr>
-        <w:t xml:space="preserve"> + </w:t>
-      </w:r>
-      <w:proofErr w:type="spellStart"/>
-      <w:r>
-        <w:rPr>
-          <w:rFonts w:asciiTheme="majorBidi" w:hAnsiTheme="majorBidi" w:cstheme="majorBidi"/>
-          <w:sz w:val="24"/>
-          <w:szCs w:val="24"/>
-        </w:rPr>
-        <w:t>other_final_demand.sum</w:t>
-      </w:r>
-      <w:proofErr w:type="spellEnd"/>
-      <w:r>
-        <w:rPr>
-          <w:rFonts w:asciiTheme="majorBidi" w:hAnsiTheme="majorBidi" w:cstheme="majorBidi"/>
-          <w:sz w:val="24"/>
-          <w:szCs w:val="24"/>
-        </w:rPr>
-        <w:t>(axis=1) ,</w:t>
-      </w:r>
-    </w:p>
-    <w:p>
-      <w:pPr>
-        <w:spacing w:after="0"/>
-        <w:rPr>
-          <w:rFonts w:asciiTheme="majorBidi" w:hAnsiTheme="majorBidi" w:cstheme="majorBidi"/>
-          <w:sz w:val="24"/>
-          <w:szCs w:val="24"/>
-        </w:rPr>
-      </w:pPr>
-      <w:r>
-        <w:rPr>
-          <w:rFonts w:asciiTheme="majorBidi" w:hAnsiTheme="majorBidi" w:cstheme="majorBidi"/>
-          <w:sz w:val="24"/>
-          <w:szCs w:val="24"/>
-        </w:rPr>
-        <w:t>        'Value Added': GDP</w:t>
-      </w:r>
-    </w:p>
-    <w:p>
-      <w:pPr>
-        <w:spacing w:after="0"/>
-        <w:rPr>
-          <w:rFonts w:asciiTheme="majorBidi" w:hAnsiTheme="majorBidi" w:cstheme="majorBidi"/>
-          <w:sz w:val="24"/>
-          <w:szCs w:val="24"/>
-        </w:rPr>
-      </w:pPr>
-      <w:r>
-        <w:rPr>
-          <w:rFonts w:asciiTheme="majorBidi" w:hAnsiTheme="majorBidi" w:cstheme="majorBidi"/>
-          <w:sz w:val="24"/>
-          <w:szCs w:val="24"/>
-        </w:rPr>
-        <w:t>    }) )</w:t>
-      </w:r>
-    </w:p>
-    <w:p>
-      <w:pPr>
-        <w:spacing w:after="0"/>
-        <w:rPr>
-          <w:rFonts w:asciiTheme="majorBidi" w:hAnsiTheme="majorBidi" w:cstheme="majorBidi"/>
-          <w:sz w:val="24"/>
-          <w:szCs w:val="24"/>
-        </w:rPr>
-      </w:pPr>
-    </w:p>
-    <w:p>
-      <w:pPr>
-        <w:spacing w:after="0"/>
-        <w:rPr>
-          <w:rFonts w:asciiTheme="majorBidi" w:hAnsiTheme="majorBidi" w:cstheme="majorBidi"/>
-          <w:sz w:val="24"/>
-          <w:szCs w:val="24"/>
-        </w:rPr>
-      </w:pPr>
-      <w:r>
-        <w:rPr>
-          <w:rFonts w:asciiTheme="majorBidi" w:hAnsiTheme="majorBidi" w:cstheme="majorBidi"/>
-          <w:sz w:val="24"/>
-          <w:szCs w:val="24"/>
-        </w:rPr>
-        <w:t>Final demand and value added are not the same at all</w:t>
-      </w:r>
-    </w:p>
-    <w:p>
-      <w:pPr>
-        <w:spacing w:after="0"/>
-        <w:rPr>
-          <w:rFonts w:asciiTheme="majorBidi" w:hAnsiTheme="majorBidi" w:cstheme="majorBidi"/>
-          <w:sz w:val="24"/>
-          <w:szCs w:val="24"/>
-        </w:rPr>
-      </w:pPr>
-    </w:p>
     <w:p>
       <w:pPr>
         <w:spacing w:after="0"/>
@@ -1266,16 +592,7 @@
           <w:szCs w:val="24"/>
           <w:highlight w:val="yellow"/>
         </w:rPr>
-        <w:t>C:\NavitComputer24\2024_NES\Economics\Data\from_OECD</w:t>
-      </w:r>
-      <w:r>
-        <w:rPr>
-          <w:rFonts w:asciiTheme="majorBidi" w:hAnsiTheme="majorBidi" w:cstheme="majorBidi"/>
-          <w:sz w:val="24"/>
-          <w:szCs w:val="24"/>
-          <w:highlight w:val="yellow"/>
-        </w:rPr>
-        <w:t>\</w:t>
+        <w:t>C:\NavitComputer24\2024_NES\Economics\Data\from_OECD\</w:t>
       </w:r>
     </w:p>
     <w:p>
@@ -1346,45 +663,91 @@
           <w:szCs w:val="24"/>
         </w:rPr>
       </w:pPr>
-    </w:p>
-    <w:p>
-      <w:pPr>
-        <w:spacing w:after="0"/>
-        <w:rPr>
-          <w:rFonts w:asciiTheme="majorBidi" w:hAnsiTheme="majorBidi" w:cstheme="majorBidi"/>
-          <w:sz w:val="24"/>
-          <w:szCs w:val="24"/>
-        </w:rPr>
-      </w:pPr>
-    </w:p>
-    <w:p>
-      <w:pPr>
-        <w:spacing w:after="0"/>
-        <w:rPr>
-          <w:rFonts w:asciiTheme="majorBidi" w:hAnsiTheme="majorBidi" w:cstheme="majorBidi"/>
-          <w:sz w:val="24"/>
-          <w:szCs w:val="24"/>
-        </w:rPr>
-      </w:pPr>
-    </w:p>
-    <w:p>
-      <w:pPr>
-        <w:spacing w:after="0"/>
-        <w:rPr>
-          <w:rFonts w:asciiTheme="majorBidi" w:hAnsiTheme="majorBidi" w:cstheme="majorBidi"/>
-          <w:sz w:val="24"/>
-          <w:szCs w:val="24"/>
-        </w:rPr>
-      </w:pPr>
-    </w:p>
-    <w:p>
-      <w:pPr>
-        <w:spacing w:after="0"/>
-        <w:rPr>
-          <w:rFonts w:asciiTheme="majorBidi" w:hAnsiTheme="majorBidi" w:cstheme="majorBidi"/>
-          <w:sz w:val="24"/>
-          <w:szCs w:val="24"/>
-          <w:lang w:val="en-US"/>
+      <w:proofErr w:type="spellStart"/>
+      <w:r>
+        <w:rPr>
+          <w:rFonts w:asciiTheme="majorBidi" w:hAnsiTheme="majorBidi" w:cstheme="majorBidi"/>
+          <w:sz w:val="24"/>
+          <w:szCs w:val="24"/>
+        </w:rPr>
+        <w:t>S</w:t>
+      </w:r>
+      <w:r>
+        <w:rPr>
+          <w:rFonts w:asciiTheme="majorBidi" w:hAnsiTheme="majorBidi" w:cstheme="majorBidi"/>
+          <w:sz w:val="24"/>
+          <w:szCs w:val="24"/>
+        </w:rPr>
+        <w:t>tatcan</w:t>
+      </w:r>
+      <w:proofErr w:type="spellEnd"/>
+      <w:r>
+        <w:rPr>
+          <w:rFonts w:asciiTheme="majorBidi" w:hAnsiTheme="majorBidi" w:cstheme="majorBidi"/>
+          <w:sz w:val="24"/>
+          <w:szCs w:val="24"/>
+        </w:rPr>
+        <w:t xml:space="preserve"> for multipliers data</w:t>
+      </w:r>
+    </w:p>
+    <w:p>
+      <w:pPr>
+        <w:spacing w:after="0"/>
+        <w:rPr>
+          <w:rFonts w:asciiTheme="majorBidi" w:hAnsiTheme="majorBidi" w:cstheme="majorBidi"/>
+          <w:sz w:val="24"/>
+          <w:szCs w:val="24"/>
+        </w:rPr>
+      </w:pPr>
+      <w:hyperlink r:id="rId14" w:history="1">
+        <w:r>
+          <w:rPr>
+            <w:rStyle w:val="Hyperlink"/>
+            <w:rFonts w:asciiTheme="majorBidi" w:hAnsiTheme="majorBidi" w:cstheme="majorBidi"/>
+            <w:sz w:val="24"/>
+            <w:szCs w:val="24"/>
+          </w:rPr>
+          <w:t>https://www150.statcan.gc.ca/t1/tbl1/en/tv.action?pid=3610059401</w:t>
+        </w:r>
+      </w:hyperlink>
+    </w:p>
+    <w:p>
+      <w:pPr>
+        <w:spacing w:after="0"/>
+        <w:rPr>
+          <w:rFonts w:asciiTheme="majorBidi" w:hAnsiTheme="majorBidi" w:cstheme="majorBidi"/>
+          <w:sz w:val="24"/>
+          <w:szCs w:val="24"/>
+        </w:rPr>
+      </w:pPr>
+    </w:p>
+    <w:p>
+      <w:pPr>
+        <w:spacing w:after="0"/>
+        <w:rPr>
+          <w:rFonts w:asciiTheme="majorBidi" w:hAnsiTheme="majorBidi" w:cstheme="majorBidi"/>
+          <w:sz w:val="24"/>
+          <w:szCs w:val="24"/>
+        </w:rPr>
+      </w:pPr>
+    </w:p>
+    <w:p>
+      <w:pPr>
+        <w:spacing w:after="0"/>
+        <w:rPr>
+          <w:rFonts w:asciiTheme="majorBidi" w:hAnsiTheme="majorBidi" w:cstheme="majorBidi"/>
+          <w:sz w:val="24"/>
+          <w:szCs w:val="24"/>
+        </w:rPr>
+      </w:pPr>
+    </w:p>
+    <w:p>
+      <w:pPr>
+        <w:spacing w:after="0"/>
+        <w:rPr>
+          <w:rFonts w:asciiTheme="majorBidi" w:hAnsiTheme="majorBidi" w:cstheme="majorBidi"/>
+          <w:sz w:val="24"/>
+          <w:szCs w:val="24"/>
         </w:rPr>
       </w:pPr>
     </w:p>

</xml_diff>

<commit_message>
environment EIA_env_copy has no FuzzyWuzzy package'
</commit_message>
<xml_diff>
--- a/OECD data.docx
+++ b/OECD data.docx
@@ -11,23 +11,13 @@
           <w:szCs w:val="24"/>
         </w:rPr>
       </w:pPr>
-      <w:proofErr w:type="spellStart"/>
-      <w:r>
-        <w:rPr>
-          <w:rFonts w:asciiTheme="majorBidi" w:hAnsiTheme="majorBidi" w:cstheme="majorBidi"/>
-          <w:sz w:val="24"/>
-          <w:szCs w:val="24"/>
-        </w:rPr>
-        <w:t>Chatgpt</w:t>
-      </w:r>
-      <w:proofErr w:type="spellEnd"/>
-      <w:r>
-        <w:rPr>
-          <w:rFonts w:asciiTheme="majorBidi" w:hAnsiTheme="majorBidi" w:cstheme="majorBidi"/>
-          <w:sz w:val="24"/>
-          <w:szCs w:val="24"/>
-        </w:rPr>
-        <w:t>:</w:t>
+      <w:r>
+        <w:rPr>
+          <w:rFonts w:asciiTheme="majorBidi" w:hAnsiTheme="majorBidi" w:cstheme="majorBidi"/>
+          <w:sz w:val="24"/>
+          <w:szCs w:val="24"/>
+        </w:rPr>
+        <w:t>Chatgpt:</w:t>
       </w:r>
     </w:p>
     <w:p>
@@ -651,19 +641,28 @@
           <w:rFonts w:asciiTheme="majorBidi" w:hAnsiTheme="majorBidi" w:cstheme="majorBidi"/>
           <w:sz w:val="24"/>
           <w:szCs w:val="24"/>
-        </w:rPr>
-      </w:pPr>
-    </w:p>
-    <w:p>
-      <w:pPr>
-        <w:spacing w:after="0"/>
-        <w:rPr>
-          <w:rFonts w:asciiTheme="majorBidi" w:hAnsiTheme="majorBidi" w:cstheme="majorBidi"/>
-          <w:sz w:val="24"/>
-          <w:szCs w:val="24"/>
-        </w:rPr>
-      </w:pPr>
-      <w:proofErr w:type="spellStart"/>
+          <w:lang w:val="en-US"/>
+        </w:rPr>
+      </w:pPr>
+      <w:r>
+        <w:rPr>
+          <w:rFonts w:asciiTheme="majorBidi" w:hAnsiTheme="majorBidi" w:cstheme="majorBidi"/>
+          <w:sz w:val="24"/>
+          <w:szCs w:val="24"/>
+          <w:lang w:val="en-US"/>
+        </w:rPr>
+        <w:t>4.25</w:t>
+      </w:r>
+    </w:p>
+    <w:p>
+      <w:pPr>
+        <w:spacing w:after="0"/>
+        <w:rPr>
+          <w:rFonts w:asciiTheme="majorBidi" w:hAnsiTheme="majorBidi" w:cstheme="majorBidi"/>
+          <w:sz w:val="24"/>
+          <w:szCs w:val="24"/>
+        </w:rPr>
+      </w:pPr>
       <w:r>
         <w:rPr>
           <w:rFonts w:asciiTheme="majorBidi" w:hAnsiTheme="majorBidi" w:cstheme="majorBidi"/>
@@ -678,16 +677,7 @@
           <w:sz w:val="24"/>
           <w:szCs w:val="24"/>
         </w:rPr>
-        <w:t>tatcan</w:t>
-      </w:r>
-      <w:proofErr w:type="spellEnd"/>
-      <w:r>
-        <w:rPr>
-          <w:rFonts w:asciiTheme="majorBidi" w:hAnsiTheme="majorBidi" w:cstheme="majorBidi"/>
-          <w:sz w:val="24"/>
-          <w:szCs w:val="24"/>
-        </w:rPr>
-        <w:t xml:space="preserve"> for multipliers data</w:t>
+        <w:t>tatcan for multipliers data</w:t>
       </w:r>
     </w:p>
     <w:p>
@@ -740,16 +730,227 @@
           <w:szCs w:val="24"/>
         </w:rPr>
       </w:pPr>
-    </w:p>
-    <w:p>
-      <w:pPr>
-        <w:spacing w:after="0"/>
-        <w:rPr>
-          <w:rFonts w:asciiTheme="majorBidi" w:hAnsiTheme="majorBidi" w:cstheme="majorBidi"/>
-          <w:sz w:val="24"/>
-          <w:szCs w:val="24"/>
-        </w:rPr>
-      </w:pPr>
+      <w:r>
+        <w:rPr>
+          <w:rFonts w:asciiTheme="majorBidi" w:hAnsiTheme="majorBidi" w:cstheme="majorBidi"/>
+          <w:sz w:val="24"/>
+          <w:szCs w:val="24"/>
+        </w:rPr>
+        <w:t>Data:</w:t>
+      </w:r>
+    </w:p>
+    <w:p>
+      <w:pPr>
+        <w:spacing w:after="0"/>
+        <w:rPr>
+          <w:rFonts w:asciiTheme="majorBidi" w:hAnsiTheme="majorBidi" w:cstheme="majorBidi"/>
+          <w:sz w:val="24"/>
+          <w:szCs w:val="24"/>
+        </w:rPr>
+      </w:pPr>
+      <w:r>
+        <w:rPr>
+          <w:rFonts w:asciiTheme="majorBidi" w:hAnsiTheme="majorBidi" w:cstheme="majorBidi"/>
+          <w:sz w:val="24"/>
+          <w:szCs w:val="24"/>
+          <w:highlight w:val="yellow"/>
+        </w:rPr>
+        <w:t>NATIODOMTMP</w:t>
+      </w:r>
+      <w:r>
+        <w:rPr>
+          <w:rFonts w:asciiTheme="majorBidi" w:hAnsiTheme="majorBidi" w:cstheme="majorBidi"/>
+          <w:sz w:val="24"/>
+          <w:szCs w:val="24"/>
+        </w:rPr>
+        <w:t xml:space="preserve"> – Main data</w:t>
+      </w:r>
+    </w:p>
+    <w:p>
+      <w:pPr>
+        <w:spacing w:after="0"/>
+        <w:rPr>
+          <w:rFonts w:asciiTheme="majorBidi" w:hAnsiTheme="majorBidi" w:cstheme="majorBidi"/>
+          <w:sz w:val="24"/>
+          <w:szCs w:val="24"/>
+        </w:rPr>
+      </w:pPr>
+      <w:r>
+        <w:rPr>
+          <w:rFonts w:asciiTheme="majorBidi" w:hAnsiTheme="majorBidi" w:cstheme="majorBidi"/>
+          <w:sz w:val="24"/>
+          <w:szCs w:val="24"/>
+          <w:highlight w:val="yellow"/>
+        </w:rPr>
+        <w:t>NATIOTTL</w:t>
+      </w:r>
+      <w:r>
+        <w:rPr>
+          <w:rFonts w:asciiTheme="majorBidi" w:hAnsiTheme="majorBidi" w:cstheme="majorBidi"/>
+          <w:sz w:val="24"/>
+          <w:szCs w:val="24"/>
+        </w:rPr>
+        <w:t xml:space="preserve"> – This was downloaded only because Tanveer used it. It is not really relevant here</w:t>
+      </w:r>
+    </w:p>
+    <w:p>
+      <w:pPr>
+        <w:spacing w:after="0"/>
+        <w:rPr>
+          <w:rFonts w:asciiTheme="majorBidi" w:hAnsiTheme="majorBidi" w:cstheme="majorBidi"/>
+          <w:sz w:val="24"/>
+          <w:szCs w:val="24"/>
+        </w:rPr>
+      </w:pPr>
+      <w:r>
+        <w:rPr>
+          <w:rFonts w:asciiTheme="majorBidi" w:hAnsiTheme="majorBidi" w:cstheme="majorBidi"/>
+          <w:sz w:val="24"/>
+          <w:szCs w:val="24"/>
+          <w:highlight w:val="yellow"/>
+        </w:rPr>
+        <w:t>NATLEONTFD</w:t>
+      </w:r>
+      <w:r>
+        <w:rPr>
+          <w:rFonts w:asciiTheme="majorBidi" w:hAnsiTheme="majorBidi" w:cstheme="majorBidi"/>
+          <w:sz w:val="24"/>
+          <w:szCs w:val="24"/>
+        </w:rPr>
+        <w:t xml:space="preserve"> – this is the leontieff matrix from OECD, for comparison, but only Ldf, not Lcdf</w:t>
+      </w:r>
+    </w:p>
+    <w:p>
+      <w:pPr>
+        <w:spacing w:after="0"/>
+        <w:rPr>
+          <w:rFonts w:asciiTheme="majorBidi" w:hAnsiTheme="majorBidi" w:cstheme="majorBidi"/>
+          <w:sz w:val="24"/>
+          <w:szCs w:val="24"/>
+        </w:rPr>
+      </w:pPr>
+      <w:r>
+        <w:rPr>
+          <w:rFonts w:asciiTheme="majorBidi" w:hAnsiTheme="majorBidi" w:cstheme="majorBidi"/>
+          <w:sz w:val="24"/>
+          <w:szCs w:val="24"/>
+          <w:highlight w:val="yellow"/>
+        </w:rPr>
+        <w:t>OECD Salaries</w:t>
+      </w:r>
+      <w:r>
+        <w:rPr>
+          <w:rFonts w:asciiTheme="majorBidi" w:hAnsiTheme="majorBidi" w:cstheme="majorBidi"/>
+          <w:sz w:val="24"/>
+          <w:szCs w:val="24"/>
+        </w:rPr>
+        <w:t xml:space="preserve"> – for salaries (from Tanveer)</w:t>
+      </w:r>
+    </w:p>
+    <w:p>
+      <w:pPr>
+        <w:spacing w:after="0"/>
+        <w:rPr>
+          <w:rFonts w:asciiTheme="majorBidi" w:hAnsiTheme="majorBidi" w:cstheme="majorBidi"/>
+          <w:sz w:val="24"/>
+          <w:szCs w:val="24"/>
+          <w:lang w:val="en-US"/>
+        </w:rPr>
+      </w:pPr>
+      <w:r>
+        <w:rPr>
+          <w:rFonts w:asciiTheme="majorBidi" w:hAnsiTheme="majorBidi" w:cstheme="majorBidi"/>
+          <w:sz w:val="24"/>
+          <w:szCs w:val="24"/>
+          <w:highlight w:val="yellow"/>
+        </w:rPr>
+        <w:t>STATCAN</w:t>
+      </w:r>
+      <w:r>
+        <w:rPr>
+          <w:rFonts w:asciiTheme="majorBidi" w:hAnsiTheme="majorBidi" w:cstheme="majorBidi"/>
+          <w:sz w:val="24"/>
+          <w:szCs w:val="24"/>
+        </w:rPr>
+        <w:t xml:space="preserve"> - </w:t>
+      </w:r>
+      <w:r>
+        <w:rPr>
+          <w:rFonts w:asciiTheme="majorBidi" w:hAnsiTheme="majorBidi" w:cstheme="majorBidi"/>
+          <w:sz w:val="24"/>
+          <w:szCs w:val="24"/>
+        </w:rPr>
+        <w:t>36100434-eng</w:t>
+      </w:r>
+      <w:r>
+        <w:rPr>
+          <w:rFonts w:asciiTheme="majorBidi" w:hAnsiTheme="majorBidi" w:cstheme="majorBidi"/>
+          <w:sz w:val="24"/>
+          <w:szCs w:val="24"/>
+        </w:rPr>
+        <w:t xml:space="preserve"> (this is for EIA_ML)</w:t>
+      </w:r>
+    </w:p>
+    <w:p>
+      <w:pPr>
+        <w:spacing w:after="0"/>
+        <w:rPr>
+          <w:rFonts w:asciiTheme="majorBidi" w:hAnsiTheme="majorBidi" w:cstheme="majorBidi"/>
+          <w:sz w:val="24"/>
+          <w:szCs w:val="24"/>
+        </w:rPr>
+      </w:pPr>
+      <w:r>
+        <w:rPr>
+          <w:rFonts w:asciiTheme="majorBidi" w:hAnsiTheme="majorBidi" w:cstheme="majorBidi"/>
+          <w:sz w:val="24"/>
+          <w:szCs w:val="24"/>
+        </w:rPr>
+        <w:t>OECD_VA_Breakdown2.csv</w:t>
+      </w:r>
+      <w:r>
+        <w:rPr>
+          <w:rFonts w:asciiTheme="majorBidi" w:hAnsiTheme="majorBidi" w:cstheme="majorBidi"/>
+          <w:sz w:val="24"/>
+          <w:szCs w:val="24"/>
+        </w:rPr>
+        <w:t xml:space="preserve"> – this is for salaries statcan from working with Mira</w:t>
+      </w:r>
+    </w:p>
+    <w:p>
+      <w:pPr>
+        <w:spacing w:after="0"/>
+        <w:rPr>
+          <w:rFonts w:asciiTheme="majorBidi" w:hAnsiTheme="majorBidi" w:cstheme="majorBidi"/>
+          <w:sz w:val="24"/>
+          <w:szCs w:val="24"/>
+        </w:rPr>
+      </w:pPr>
+      <w:r>
+        <w:rPr>
+          <w:rFonts w:asciiTheme="majorBidi" w:hAnsiTheme="majorBidi" w:cstheme="majorBidi"/>
+          <w:sz w:val="24"/>
+          <w:szCs w:val="24"/>
+          <w:highlight w:val="yellow"/>
+        </w:rPr>
+        <w:t>statcan_multipliers_2015</w:t>
+      </w:r>
+      <w:r>
+        <w:rPr>
+          <w:rFonts w:asciiTheme="majorBidi" w:hAnsiTheme="majorBidi" w:cstheme="majorBidi"/>
+          <w:sz w:val="24"/>
+          <w:szCs w:val="24"/>
+        </w:rPr>
+        <w:t xml:space="preserve"> – this is statcan multipliers</w:t>
+      </w:r>
+      <w:r>
+        <w:rPr>
+          <w:rFonts w:asciiTheme="majorBidi" w:hAnsiTheme="majorBidi" w:cstheme="majorBidi"/>
+          <w:sz w:val="24"/>
+          <w:szCs w:val="24"/>
+        </w:rPr>
+        <w:t xml:space="preserve"> I think Tanveer sent it by email</w:t>
+      </w:r>
     </w:p>
     <w:sectPr>
       <w:pgSz w:w="11906" w:h="16838"/>

</xml_diff>

<commit_message>
func_data_upload_OECD_salaries.py has a J row now
</commit_message>
<xml_diff>
--- a/OECD data.docx
+++ b/OECD data.docx
@@ -11,13 +11,23 @@
           <w:szCs w:val="24"/>
         </w:rPr>
       </w:pPr>
-      <w:r>
-        <w:rPr>
-          <w:rFonts w:asciiTheme="majorBidi" w:hAnsiTheme="majorBidi" w:cstheme="majorBidi"/>
-          <w:sz w:val="24"/>
-          <w:szCs w:val="24"/>
-        </w:rPr>
-        <w:t>Chatgpt:</w:t>
+      <w:proofErr w:type="spellStart"/>
+      <w:r>
+        <w:rPr>
+          <w:rFonts w:asciiTheme="majorBidi" w:hAnsiTheme="majorBidi" w:cstheme="majorBidi"/>
+          <w:sz w:val="24"/>
+          <w:szCs w:val="24"/>
+        </w:rPr>
+        <w:t>Chatgpt</w:t>
+      </w:r>
+      <w:proofErr w:type="spellEnd"/>
+      <w:r>
+        <w:rPr>
+          <w:rFonts w:asciiTheme="majorBidi" w:hAnsiTheme="majorBidi" w:cstheme="majorBidi"/>
+          <w:sz w:val="24"/>
+          <w:szCs w:val="24"/>
+        </w:rPr>
+        <w:t>:</w:t>
       </w:r>
     </w:p>
     <w:p>
@@ -663,6 +673,7 @@
           <w:szCs w:val="24"/>
         </w:rPr>
       </w:pPr>
+      <w:proofErr w:type="spellStart"/>
       <w:r>
         <w:rPr>
           <w:rFonts w:asciiTheme="majorBidi" w:hAnsiTheme="majorBidi" w:cstheme="majorBidi"/>
@@ -677,7 +688,16 @@
           <w:sz w:val="24"/>
           <w:szCs w:val="24"/>
         </w:rPr>
-        <w:t>tatcan for multipliers data</w:t>
+        <w:t>tatcan</w:t>
+      </w:r>
+      <w:proofErr w:type="spellEnd"/>
+      <w:r>
+        <w:rPr>
+          <w:rFonts w:asciiTheme="majorBidi" w:hAnsiTheme="majorBidi" w:cstheme="majorBidi"/>
+          <w:sz w:val="24"/>
+          <w:szCs w:val="24"/>
+        </w:rPr>
+        <w:t xml:space="preserve"> for multipliers data</w:t>
       </w:r>
     </w:p>
     <w:p>
@@ -817,8 +837,54 @@
           <w:sz w:val="24"/>
           <w:szCs w:val="24"/>
         </w:rPr>
-        <w:t xml:space="preserve"> – this is the leontieff matrix from OECD, for comparison, but only Ldf, not Lcdf</w:t>
-      </w:r>
+        <w:t xml:space="preserve"> – this is the </w:t>
+      </w:r>
+      <w:proofErr w:type="spellStart"/>
+      <w:r>
+        <w:rPr>
+          <w:rFonts w:asciiTheme="majorBidi" w:hAnsiTheme="majorBidi" w:cstheme="majorBidi"/>
+          <w:sz w:val="24"/>
+          <w:szCs w:val="24"/>
+        </w:rPr>
+        <w:t>leontieff</w:t>
+      </w:r>
+      <w:proofErr w:type="spellEnd"/>
+      <w:r>
+        <w:rPr>
+          <w:rFonts w:asciiTheme="majorBidi" w:hAnsiTheme="majorBidi" w:cstheme="majorBidi"/>
+          <w:sz w:val="24"/>
+          <w:szCs w:val="24"/>
+        </w:rPr>
+        <w:t xml:space="preserve"> matrix from OECD, for comparison, but only </w:t>
+      </w:r>
+      <w:proofErr w:type="spellStart"/>
+      <w:r>
+        <w:rPr>
+          <w:rFonts w:asciiTheme="majorBidi" w:hAnsiTheme="majorBidi" w:cstheme="majorBidi"/>
+          <w:sz w:val="24"/>
+          <w:szCs w:val="24"/>
+        </w:rPr>
+        <w:t>Ldf</w:t>
+      </w:r>
+      <w:proofErr w:type="spellEnd"/>
+      <w:r>
+        <w:rPr>
+          <w:rFonts w:asciiTheme="majorBidi" w:hAnsiTheme="majorBidi" w:cstheme="majorBidi"/>
+          <w:sz w:val="24"/>
+          <w:szCs w:val="24"/>
+        </w:rPr>
+        <w:t xml:space="preserve">, not </w:t>
+      </w:r>
+      <w:proofErr w:type="spellStart"/>
+      <w:r>
+        <w:rPr>
+          <w:rFonts w:asciiTheme="majorBidi" w:hAnsiTheme="majorBidi" w:cstheme="majorBidi"/>
+          <w:sz w:val="24"/>
+          <w:szCs w:val="24"/>
+        </w:rPr>
+        <w:t>Lcdf</w:t>
+      </w:r>
+      <w:proofErr w:type="spellEnd"/>
     </w:p>
     <w:p>
       <w:pPr>
@@ -914,16 +980,35 @@
           <w:sz w:val="24"/>
           <w:szCs w:val="24"/>
         </w:rPr>
-        <w:t xml:space="preserve"> – this is for salaries statcan from working with Mira</w:t>
-      </w:r>
-    </w:p>
-    <w:p>
-      <w:pPr>
-        <w:spacing w:after="0"/>
-        <w:rPr>
-          <w:rFonts w:asciiTheme="majorBidi" w:hAnsiTheme="majorBidi" w:cstheme="majorBidi"/>
-          <w:sz w:val="24"/>
-          <w:szCs w:val="24"/>
+        <w:t xml:space="preserve"> – this is for salaries </w:t>
+      </w:r>
+      <w:proofErr w:type="spellStart"/>
+      <w:r>
+        <w:rPr>
+          <w:rFonts w:asciiTheme="majorBidi" w:hAnsiTheme="majorBidi" w:cstheme="majorBidi"/>
+          <w:sz w:val="24"/>
+          <w:szCs w:val="24"/>
+        </w:rPr>
+        <w:t>statcan</w:t>
+      </w:r>
+      <w:proofErr w:type="spellEnd"/>
+      <w:r>
+        <w:rPr>
+          <w:rFonts w:asciiTheme="majorBidi" w:hAnsiTheme="majorBidi" w:cstheme="majorBidi"/>
+          <w:sz w:val="24"/>
+          <w:szCs w:val="24"/>
+        </w:rPr>
+        <w:t xml:space="preserve"> from working with Mira</w:t>
+      </w:r>
+    </w:p>
+    <w:p>
+      <w:pPr>
+        <w:spacing w:after="0"/>
+        <w:rPr>
+          <w:rFonts w:asciiTheme="majorBidi" w:hAnsiTheme="majorBidi" w:cstheme="majorBidi"/>
+          <w:sz w:val="24"/>
+          <w:szCs w:val="24"/>
+          <w:rtl/>
         </w:rPr>
       </w:pPr>
       <w:r>
@@ -941,7 +1026,25 @@
           <w:sz w:val="24"/>
           <w:szCs w:val="24"/>
         </w:rPr>
-        <w:t xml:space="preserve"> – this is statcan multipliers</w:t>
+        <w:t xml:space="preserve"> – this is </w:t>
+      </w:r>
+      <w:proofErr w:type="spellStart"/>
+      <w:r>
+        <w:rPr>
+          <w:rFonts w:asciiTheme="majorBidi" w:hAnsiTheme="majorBidi" w:cstheme="majorBidi"/>
+          <w:sz w:val="24"/>
+          <w:szCs w:val="24"/>
+        </w:rPr>
+        <w:t>statcan</w:t>
+      </w:r>
+      <w:proofErr w:type="spellEnd"/>
+      <w:r>
+        <w:rPr>
+          <w:rFonts w:asciiTheme="majorBidi" w:hAnsiTheme="majorBidi" w:cstheme="majorBidi"/>
+          <w:sz w:val="24"/>
+          <w:szCs w:val="24"/>
+        </w:rPr>
+        <w:t xml:space="preserve"> multipliers</w:t>
       </w:r>
       <w:r>
         <w:rPr>
@@ -950,6 +1053,218 @@
           <w:szCs w:val="24"/>
         </w:rPr>
         <w:t xml:space="preserve"> I think Tanveer sent it by email</w:t>
+      </w:r>
+    </w:p>
+    <w:p>
+      <w:pPr>
+        <w:spacing w:after="0"/>
+        <w:rPr>
+          <w:rFonts w:asciiTheme="majorBidi" w:hAnsiTheme="majorBidi" w:cstheme="majorBidi"/>
+          <w:sz w:val="24"/>
+          <w:szCs w:val="24"/>
+          <w:rtl/>
+        </w:rPr>
+      </w:pPr>
+    </w:p>
+    <w:p>
+      <w:pPr>
+        <w:spacing w:after="0"/>
+        <w:rPr>
+          <w:rFonts w:asciiTheme="majorBidi" w:hAnsiTheme="majorBidi" w:cstheme="majorBidi"/>
+          <w:sz w:val="24"/>
+          <w:szCs w:val="24"/>
+          <w:rtl/>
+        </w:rPr>
+      </w:pPr>
+    </w:p>
+    <w:p>
+      <w:pPr>
+        <w:spacing w:after="0"/>
+        <w:rPr>
+          <w:rFonts w:asciiTheme="majorBidi" w:hAnsiTheme="majorBidi" w:cstheme="majorBidi"/>
+          <w:sz w:val="24"/>
+          <w:szCs w:val="24"/>
+          <w:lang w:val="en-US"/>
+        </w:rPr>
+      </w:pPr>
+      <w:r>
+        <w:rPr>
+          <w:rFonts w:asciiTheme="majorBidi" w:hAnsiTheme="majorBidi" w:cstheme="majorBidi"/>
+          <w:sz w:val="24"/>
+          <w:szCs w:val="24"/>
+          <w:lang w:val="en-US"/>
+        </w:rPr>
+        <w:t>J61 telecommunication</w:t>
+      </w:r>
+    </w:p>
+    <w:p>
+      <w:pPr>
+        <w:spacing w:after="0"/>
+        <w:rPr>
+          <w:rFonts w:asciiTheme="majorBidi" w:hAnsiTheme="majorBidi" w:cstheme="majorBidi"/>
+          <w:sz w:val="24"/>
+          <w:szCs w:val="24"/>
+          <w:lang w:val="en-US"/>
+        </w:rPr>
+      </w:pPr>
+      <w:r>
+        <w:rPr>
+          <w:rFonts w:asciiTheme="majorBidi" w:hAnsiTheme="majorBidi" w:cstheme="majorBidi"/>
+          <w:sz w:val="24"/>
+          <w:szCs w:val="24"/>
+          <w:lang w:val="en-US"/>
+        </w:rPr>
+        <w:t>J58T60 Publishing, broadcasting</w:t>
+      </w:r>
+    </w:p>
+    <w:p>
+      <w:pPr>
+        <w:spacing w:after="0"/>
+        <w:rPr>
+          <w:rFonts w:asciiTheme="majorBidi" w:hAnsiTheme="majorBidi" w:cstheme="majorBidi"/>
+          <w:sz w:val="24"/>
+          <w:szCs w:val="24"/>
+          <w:lang w:val="en-US"/>
+        </w:rPr>
+      </w:pPr>
+      <w:r>
+        <w:rPr>
+          <w:rFonts w:asciiTheme="majorBidi" w:hAnsiTheme="majorBidi" w:cstheme="majorBidi"/>
+          <w:sz w:val="24"/>
+          <w:szCs w:val="24"/>
+          <w:lang w:val="en-US"/>
+        </w:rPr>
+        <w:t>T62_63 IT and other information services</w:t>
+      </w:r>
+    </w:p>
+    <w:p>
+      <w:pPr>
+        <w:spacing w:after="0"/>
+        <w:rPr>
+          <w:rFonts w:asciiTheme="majorBidi" w:hAnsiTheme="majorBidi" w:cstheme="majorBidi"/>
+          <w:sz w:val="24"/>
+          <w:szCs w:val="24"/>
+          <w:lang w:val="en-US"/>
+        </w:rPr>
+      </w:pPr>
+    </w:p>
+    <w:p>
+      <w:pPr>
+        <w:spacing w:after="0"/>
+        <w:rPr>
+          <w:rFonts w:asciiTheme="majorBidi" w:hAnsiTheme="majorBidi" w:cstheme="majorBidi"/>
+          <w:sz w:val="24"/>
+          <w:szCs w:val="24"/>
+        </w:rPr>
+      </w:pPr>
+      <w:proofErr w:type="spellStart"/>
+      <w:r>
+        <w:rPr>
+          <w:rFonts w:asciiTheme="majorBidi" w:hAnsiTheme="majorBidi" w:cstheme="majorBidi"/>
+          <w:sz w:val="24"/>
+          <w:szCs w:val="24"/>
+        </w:rPr>
+        <w:t>OECD_codes</w:t>
+      </w:r>
+      <w:proofErr w:type="spellEnd"/>
+      <w:r>
+        <w:rPr>
+          <w:rFonts w:asciiTheme="majorBidi" w:hAnsiTheme="majorBidi" w:cstheme="majorBidi"/>
+          <w:sz w:val="24"/>
+          <w:szCs w:val="24"/>
+        </w:rPr>
+        <w:t xml:space="preserve"> OBS_VALUE_USD </w:t>
+      </w:r>
+    </w:p>
+    <w:p>
+      <w:pPr>
+        <w:spacing w:after="0"/>
+        <w:rPr>
+          <w:rFonts w:asciiTheme="majorBidi" w:hAnsiTheme="majorBidi" w:cstheme="majorBidi"/>
+          <w:sz w:val="24"/>
+          <w:szCs w:val="24"/>
+        </w:rPr>
+      </w:pPr>
+      <w:r>
+        <w:rPr>
+          <w:rFonts w:asciiTheme="majorBidi" w:hAnsiTheme="majorBidi" w:cstheme="majorBidi"/>
+          <w:sz w:val="24"/>
+          <w:szCs w:val="24"/>
+        </w:rPr>
+        <w:t xml:space="preserve">53 J 64990.6 </w:t>
+      </w:r>
+    </w:p>
+    <w:p>
+      <w:pPr>
+        <w:spacing w:after="0"/>
+        <w:rPr>
+          <w:rFonts w:asciiTheme="majorBidi" w:hAnsiTheme="majorBidi" w:cstheme="majorBidi"/>
+          <w:sz w:val="24"/>
+          <w:szCs w:val="24"/>
+        </w:rPr>
+      </w:pPr>
+      <w:r>
+        <w:rPr>
+          <w:rFonts w:asciiTheme="majorBidi" w:hAnsiTheme="majorBidi" w:cstheme="majorBidi"/>
+          <w:sz w:val="24"/>
+          <w:szCs w:val="24"/>
+        </w:rPr>
+        <w:t xml:space="preserve">54 J58T60 13504.4 </w:t>
+      </w:r>
+    </w:p>
+    <w:p>
+      <w:pPr>
+        <w:spacing w:after="0"/>
+        <w:rPr>
+          <w:rFonts w:asciiTheme="majorBidi" w:hAnsiTheme="majorBidi" w:cstheme="majorBidi"/>
+          <w:sz w:val="24"/>
+          <w:szCs w:val="24"/>
+        </w:rPr>
+      </w:pPr>
+      <w:r>
+        <w:rPr>
+          <w:rFonts w:asciiTheme="majorBidi" w:hAnsiTheme="majorBidi" w:cstheme="majorBidi"/>
+          <w:sz w:val="24"/>
+          <w:szCs w:val="24"/>
+        </w:rPr>
+        <w:t xml:space="preserve">55 J62 21595.4 </w:t>
+      </w:r>
+    </w:p>
+    <w:p>
+      <w:pPr>
+        <w:spacing w:after="0"/>
+        <w:rPr>
+          <w:rFonts w:asciiTheme="majorBidi" w:hAnsiTheme="majorBidi" w:cstheme="majorBidi"/>
+          <w:sz w:val="24"/>
+          <w:szCs w:val="24"/>
+        </w:rPr>
+      </w:pPr>
+      <w:r>
+        <w:rPr>
+          <w:rFonts w:asciiTheme="majorBidi" w:hAnsiTheme="majorBidi" w:cstheme="majorBidi"/>
+          <w:sz w:val="24"/>
+          <w:szCs w:val="24"/>
+        </w:rPr>
+        <w:t xml:space="preserve">56 J62_63 25193.9 </w:t>
+      </w:r>
+    </w:p>
+    <w:p>
+      <w:pPr>
+        <w:spacing w:after="0"/>
+        <w:rPr>
+          <w:rFonts w:asciiTheme="majorBidi" w:hAnsiTheme="majorBidi" w:cstheme="majorBidi"/>
+          <w:sz w:val="24"/>
+          <w:szCs w:val="24"/>
+          <w:lang w:val="fr-CA"/>
+        </w:rPr>
+      </w:pPr>
+      <w:r>
+        <w:rPr>
+          <w:rFonts w:asciiTheme="majorBidi" w:hAnsiTheme="majorBidi" w:cstheme="majorBidi"/>
+          <w:sz w:val="24"/>
+          <w:szCs w:val="24"/>
+        </w:rPr>
+        <w:t>57 J63 3598.4</w:t>
       </w:r>
     </w:p>
     <w:sectPr>
@@ -1563,7 +1878,6 @@
   <w:style w:type="character" w:default="1" w:styleId="DefaultParagraphFont">
     <w:name w:val="Default Paragraph Font"/>
     <w:uiPriority w:val="1"/>
-    <w:semiHidden/>
     <w:unhideWhenUsed/>
   </w:style>
   <w:style w:type="table" w:default="1" w:styleId="TableNormal">

</xml_diff>